<commit_message>
Added Details For Evaluation
</commit_message>
<xml_diff>
--- a/Task3b_Evaluation_LL-000020908_Ram_D.docx
+++ b/Task3b_Evaluation_LL-000020908_Ram_D.docx
@@ -1,11 +1,13 @@
 
 <file path=word/document.xml><?xml version="1.0" encoding="utf-8"?>
-<w:document xmlns:wpc="http://schemas.microsoft.com/office/word/2010/wordprocessingCanvas" xmlns:cx="http://schemas.microsoft.com/office/drawing/2014/chartex" xmlns:cx1="http://schemas.microsoft.com/office/drawing/2015/9/8/chartex" xmlns:cx2="http://schemas.microsoft.com/office/drawing/2015/10/21/chartex" xmlns:cx3="http://schemas.microsoft.com/office/drawing/2016/5/9/chartex" xmlns:cx4="http://schemas.microsoft.com/office/drawing/2016/5/10/chartex" xmlns:cx5="http://schemas.microsoft.com/office/drawing/2016/5/11/chartex" xmlns:cx6="http://schemas.microsoft.com/office/drawing/2016/5/12/chartex" xmlns:cx7="http://schemas.microsoft.com/office/drawing/2016/5/13/chartex" xmlns:cx8="http://schemas.microsoft.com/office/drawing/2016/5/14/chartex" xmlns:mc="http://schemas.openxmlformats.org/markup-compatibility/2006" xmlns:aink="http://schemas.microsoft.com/office/drawing/2016/ink" xmlns:am3d="http://schemas.microsoft.com/office/drawing/2017/model3d" xmlns:o="urn:schemas-microsoft-com:office:office" xmlns:r="http://schemas.openxmlformats.org/officeDocument/2006/relationships" xmlns:m="http://schemas.openxmlformats.org/officeDocument/2006/math" xmlns:v="urn:schemas-microsoft-com:vml" xmlns:wp14="http://schemas.microsoft.com/office/word/2010/wordprocessingDrawing" xmlns:wp="http://schemas.openxmlformats.org/drawingml/2006/wordprocessingDrawing" xmlns:w10="urn:schemas-microsoft-com:office:word" xmlns:w="http://schemas.openxmlformats.org/wordprocessingml/2006/main" xmlns:w14="http://schemas.microsoft.com/office/word/2010/wordml" xmlns:w15="http://schemas.microsoft.com/office/word/2012/wordml" xmlns:w16cex="http://schemas.microsoft.com/office/word/2018/wordml/cex" xmlns:w16cid="http://schemas.microsoft.com/office/word/2016/wordml/cid" xmlns:w16="http://schemas.microsoft.com/office/word/2018/wordml" xmlns:w16sdtdh="http://schemas.microsoft.com/office/word/2020/wordml/sdtdatahash" xmlns:w16se="http://schemas.microsoft.com/office/word/2015/wordml/symex" xmlns:wpg="http://schemas.microsoft.com/office/word/2010/wordprocessingGroup" xmlns:wpi="http://schemas.microsoft.com/office/word/2010/wordprocessingInk" xmlns:wne="http://schemas.microsoft.com/office/word/2006/wordml" xmlns:wps="http://schemas.microsoft.com/office/word/2010/wordprocessingShape" mc:Ignorable="w14 w15 w16se w16cid w16 w16cex w16sdtdh wp14">
+<w:document xmlns:wpc="http://schemas.microsoft.com/office/word/2010/wordprocessingCanvas" xmlns:cx="http://schemas.microsoft.com/office/drawing/2014/chartex" xmlns:cx1="http://schemas.microsoft.com/office/drawing/2015/9/8/chartex" xmlns:cx2="http://schemas.microsoft.com/office/drawing/2015/10/21/chartex" xmlns:cx3="http://schemas.microsoft.com/office/drawing/2016/5/9/chartex" xmlns:cx4="http://schemas.microsoft.com/office/drawing/2016/5/10/chartex" xmlns:cx5="http://schemas.microsoft.com/office/drawing/2016/5/11/chartex" xmlns:cx6="http://schemas.microsoft.com/office/drawing/2016/5/12/chartex" xmlns:cx7="http://schemas.microsoft.com/office/drawing/2016/5/13/chartex" xmlns:cx8="http://schemas.microsoft.com/office/drawing/2016/5/14/chartex" xmlns:mc="http://schemas.openxmlformats.org/markup-compatibility/2006" xmlns:aink="http://schemas.microsoft.com/office/drawing/2016/ink" xmlns:am3d="http://schemas.microsoft.com/office/drawing/2017/model3d" xmlns:o="urn:schemas-microsoft-com:office:office" xmlns:oel="http://schemas.microsoft.com/office/2019/extlst" xmlns:r="http://schemas.openxmlformats.org/officeDocument/2006/relationships" xmlns:m="http://schemas.openxmlformats.org/officeDocument/2006/math" xmlns:v="urn:schemas-microsoft-com:vml" xmlns:wp14="http://schemas.microsoft.com/office/word/2010/wordprocessingDrawing" xmlns:wp="http://schemas.openxmlformats.org/drawingml/2006/wordprocessingDrawing" xmlns:w10="urn:schemas-microsoft-com:office:word" xmlns:w="http://schemas.openxmlformats.org/wordprocessingml/2006/main" xmlns:w14="http://schemas.microsoft.com/office/word/2010/wordml" xmlns:w15="http://schemas.microsoft.com/office/word/2012/wordml" xmlns:w16cex="http://schemas.microsoft.com/office/word/2018/wordml/cex" xmlns:w16cid="http://schemas.microsoft.com/office/word/2016/wordml/cid" xmlns:w16="http://schemas.microsoft.com/office/word/2018/wordml" xmlns:w16du="http://schemas.microsoft.com/office/word/2023/wordml/word16du" xmlns:w16sdtdh="http://schemas.microsoft.com/office/word/2020/wordml/sdtdatahash" xmlns:w16sdtfl="http://schemas.microsoft.com/office/word/2024/wordml/sdtformatlock" xmlns:w16se="http://schemas.microsoft.com/office/word/2015/wordml/symex" xmlns:wpg="http://schemas.microsoft.com/office/word/2010/wordprocessingGroup" xmlns:wpi="http://schemas.microsoft.com/office/word/2010/wordprocessingInk" xmlns:wne="http://schemas.microsoft.com/office/word/2006/wordml" xmlns:wps="http://schemas.microsoft.com/office/word/2010/wordprocessingShape" mc:Ignorable="w14 w15 w16se w16cid w16 w16cex w16sdtdh w16sdtfl w16du wp14">
   <w:body>
     <w:sdt>
       <w:sdtPr>
         <w:rPr>
+          <w:rFonts w:eastAsiaTheme="minorHAnsi"/>
           <w:color w:val="4472C4" w:themeColor="accent1"/>
+          <w:lang w:eastAsia="en-US"/>
         </w:rPr>
         <w:id w:val="-1039746895"/>
         <w:docPartObj>
@@ -15,9 +17,7 @@
       </w:sdtPr>
       <w:sdtEndPr>
         <w:rPr>
-          <w:rFonts w:eastAsiaTheme="minorHAnsi"/>
           <w:color w:val="auto"/>
-          <w:lang w:eastAsia="en-US"/>
         </w:rPr>
       </w:sdtEndPr>
       <w:sdtContent>
@@ -262,7 +262,7 @@
                     <v:stroke joinstyle="miter"/>
                     <v:path gradientshapeok="t" o:connecttype="rect"/>
                   </v:shapetype>
-                  <v:shape id="Text Box 142" o:spid="_x0000_s1026" type="#_x0000_t202" style="position:absolute;left:0;text-align:left;margin-left:0;margin-top:0;width:516pt;height:43.9pt;z-index:251659264;visibility:visible;mso-wrap-style:square;mso-width-percent:1000;mso-height-percent:0;mso-top-percent:850;mso-wrap-distance-left:9pt;mso-wrap-distance-top:0;mso-wrap-distance-right:9pt;mso-wrap-distance-bottom:0;mso-position-horizontal:center;mso-position-horizontal-relative:margin;mso-position-vertical-relative:page;mso-width-percent:1000;mso-height-percent:0;mso-top-percent:850;mso-width-relative:margin;mso-height-relative:margin;v-text-anchor:bottom" o:gfxdata="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" filled="f" stroked="f" strokeweight=".5pt">
+                  <v:shape id="Text Box 142" o:spid="_x0000_s1026" type="#_x0000_t202" style="position:absolute;left:0;text-align:left;margin-left:0;margin-top:0;width:516pt;height:43.9pt;z-index:251659264;visibility:visible;mso-wrap-style:square;mso-width-percent:1000;mso-height-percent:0;mso-top-percent:850;mso-wrap-distance-left:9pt;mso-wrap-distance-top:0;mso-wrap-distance-right:9pt;mso-wrap-distance-bottom:0;mso-position-horizontal:center;mso-position-horizontal-relative:margin;mso-position-vertical-relative:page;mso-width-percent:1000;mso-height-percent:0;mso-top-percent:850;mso-width-relative:margin;mso-height-relative:margin;v-text-anchor:bottom" o:gfxdata="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" filled="f" stroked="f" strokeweight=".5pt">
                     <v:textbox style="mso-fit-shape-to-text:t" inset="0,0,0,0">
                       <w:txbxContent>
                         <w:p>
@@ -451,14 +451,7 @@
                 <w:b/>
                 <w:bCs/>
               </w:rPr>
-              <w:t>L</w:t>
-            </w:r>
-            <w:r>
-              <w:rPr>
-                <w:b/>
-                <w:bCs/>
-              </w:rPr>
-              <w:t>egal and ethical implications</w:t>
+              <w:t>Legal and ethical implications</w:t>
             </w:r>
           </w:p>
         </w:tc>
@@ -469,68 +462,8 @@
             <w:tcW w:w="3586" w:type="dxa"/>
           </w:tcPr>
           <w:p>
-            <w:hyperlink r:id="rId7" w:history="1">
-              <w:r>
-                <w:rPr>
-                  <w:rStyle w:val="Hyperlink"/>
-                </w:rPr>
-                <w:t>https://pixabay.com/photos/girl-teenage-girl-eyes-beauty-7172289/</w:t>
-              </w:r>
-            </w:hyperlink>
-          </w:p>
-          <w:p>
-            <w:r>
-              <w:rPr>
-                <w:noProof/>
-              </w:rPr>
-              <w:drawing>
-                <wp:inline distT="0" distB="0" distL="0" distR="0" wp14:anchorId="0AB5D4B3" wp14:editId="78F23D3D">
-                  <wp:extent cx="2053988" cy="1437974"/>
-                  <wp:effectExtent l="0" t="0" r="3810" b="0"/>
-                  <wp:docPr id="1" name="Picture 1"/>
-                  <wp:cNvGraphicFramePr>
-                    <a:graphicFrameLocks xmlns:a="http://schemas.openxmlformats.org/drawingml/2006/main" noChangeAspect="1"/>
-                  </wp:cNvGraphicFramePr>
-                  <a:graphic xmlns:a="http://schemas.openxmlformats.org/drawingml/2006/main">
-                    <a:graphicData uri="http://schemas.openxmlformats.org/drawingml/2006/picture">
-                      <pic:pic xmlns:pic="http://schemas.openxmlformats.org/drawingml/2006/picture">
-                        <pic:nvPicPr>
-                          <pic:cNvPr id="0" name="Picture 1"/>
-                          <pic:cNvPicPr>
-                            <a:picLocks noChangeAspect="1" noChangeArrowheads="1"/>
-                          </pic:cNvPicPr>
-                        </pic:nvPicPr>
-                        <pic:blipFill>
-                          <a:blip r:embed="rId8" cstate="print">
-                            <a:extLst>
-                              <a:ext uri="{28A0092B-C50C-407E-A947-70E740481C1C}">
-                                <a14:useLocalDpi xmlns:a14="http://schemas.microsoft.com/office/drawing/2010/main" val="0"/>
-                              </a:ext>
-                            </a:extLst>
-                          </a:blip>
-                          <a:srcRect/>
-                          <a:stretch>
-                            <a:fillRect/>
-                          </a:stretch>
-                        </pic:blipFill>
-                        <pic:spPr bwMode="auto">
-                          <a:xfrm>
-                            <a:off x="0" y="0"/>
-                            <a:ext cx="2074446" cy="1452296"/>
-                          </a:xfrm>
-                          <a:prstGeom prst="rect">
-                            <a:avLst/>
-                          </a:prstGeom>
-                          <a:noFill/>
-                          <a:ln>
-                            <a:noFill/>
-                          </a:ln>
-                        </pic:spPr>
-                      </pic:pic>
-                    </a:graphicData>
-                  </a:graphic>
-                </wp:inline>
-              </w:drawing>
+            <w:r>
+              <w:t>Organic Carrots</w:t>
             </w:r>
           </w:p>
         </w:tc>
@@ -538,48 +471,19 @@
           <w:tcPr>
             <w:tcW w:w="2363" w:type="dxa"/>
           </w:tcPr>
-          <w:p>
-            <w:r>
-              <w:t>This was not appropriate to use t</w:t>
-            </w:r>
-            <w:r>
-              <w:t>o show a picture for a staff member called “Alice Johnson”</w:t>
-            </w:r>
-            <w:r>
-              <w:t>. Since, the picture is not professional which would be industry standard for other companies. Furthermore, it makes the staff look less trustworthy due to their outfit and their pose. This will result in corporate clients of the company to not do business with them.</w:t>
-            </w:r>
-          </w:p>
+          <w:p/>
         </w:tc>
         <w:tc>
           <w:tcPr>
             <w:tcW w:w="2126" w:type="dxa"/>
           </w:tcPr>
-          <w:p>
-            <w:r>
-              <w:t xml:space="preserve">The source was unreliable since it did not actually give the picture of actual staff working at </w:t>
-            </w:r>
-            <w:proofErr w:type="spellStart"/>
-            <w:r>
-              <w:t>CityPoint</w:t>
-            </w:r>
-            <w:proofErr w:type="spellEnd"/>
-            <w:r>
-              <w:t xml:space="preserve"> Room Hire. However, this does not matter for the solution as this is a prototype that is not going to be actually used by the company. But in the actual solution the source needs to be reliable, so the client does not deceive their customers.</w:t>
-            </w:r>
-          </w:p>
+          <w:p/>
         </w:tc>
         <w:tc>
           <w:tcPr>
             <w:tcW w:w="2268" w:type="dxa"/>
           </w:tcPr>
-          <w:p>
-            <w:r>
-              <w:t xml:space="preserve">This asset </w:t>
-            </w:r>
-            <w:r>
-              <w:t>has the legal implication to be used freely except in logos, trademarks or to ruin the someone’s reputation. This has the ethical implication of not representing the actual person that the picture should be in the staff’s details.</w:t>
-            </w:r>
-          </w:p>
+          <w:p/>
         </w:tc>
       </w:tr>
       <w:tr>
@@ -588,68 +492,8 @@
             <w:tcW w:w="3586" w:type="dxa"/>
           </w:tcPr>
           <w:p>
-            <w:hyperlink r:id="rId9" w:history="1">
-              <w:r>
-                <w:rPr>
-                  <w:rStyle w:val="Hyperlink"/>
-                </w:rPr>
-                <w:t>https://pixabay.com/photos/male-men-attractive-beauty-8032473/</w:t>
-              </w:r>
-            </w:hyperlink>
-          </w:p>
-          <w:p>
-            <w:r>
-              <w:rPr>
-                <w:noProof/>
-              </w:rPr>
-              <w:drawing>
-                <wp:inline distT="0" distB="0" distL="0" distR="0" wp14:anchorId="25F4E249" wp14:editId="5C7D42EA">
-                  <wp:extent cx="2033516" cy="2037121"/>
-                  <wp:effectExtent l="0" t="0" r="5080" b="1270"/>
-                  <wp:docPr id="2" name="Picture 2"/>
-                  <wp:cNvGraphicFramePr>
-                    <a:graphicFrameLocks xmlns:a="http://schemas.openxmlformats.org/drawingml/2006/main" noChangeAspect="1"/>
-                  </wp:cNvGraphicFramePr>
-                  <a:graphic xmlns:a="http://schemas.openxmlformats.org/drawingml/2006/main">
-                    <a:graphicData uri="http://schemas.openxmlformats.org/drawingml/2006/picture">
-                      <pic:pic xmlns:pic="http://schemas.openxmlformats.org/drawingml/2006/picture">
-                        <pic:nvPicPr>
-                          <pic:cNvPr id="0" name="Picture 3"/>
-                          <pic:cNvPicPr>
-                            <a:picLocks noChangeAspect="1" noChangeArrowheads="1"/>
-                          </pic:cNvPicPr>
-                        </pic:nvPicPr>
-                        <pic:blipFill>
-                          <a:blip r:embed="rId10" cstate="print">
-                            <a:extLst>
-                              <a:ext uri="{28A0092B-C50C-407E-A947-70E740481C1C}">
-                                <a14:useLocalDpi xmlns:a14="http://schemas.microsoft.com/office/drawing/2010/main" val="0"/>
-                              </a:ext>
-                            </a:extLst>
-                          </a:blip>
-                          <a:srcRect/>
-                          <a:stretch>
-                            <a:fillRect/>
-                          </a:stretch>
-                        </pic:blipFill>
-                        <pic:spPr bwMode="auto">
-                          <a:xfrm>
-                            <a:off x="0" y="0"/>
-                            <a:ext cx="2051066" cy="2054702"/>
-                          </a:xfrm>
-                          <a:prstGeom prst="rect">
-                            <a:avLst/>
-                          </a:prstGeom>
-                          <a:noFill/>
-                          <a:ln>
-                            <a:noFill/>
-                          </a:ln>
-                        </pic:spPr>
-                      </pic:pic>
-                    </a:graphicData>
-                  </a:graphic>
-                </wp:inline>
-              </w:drawing>
+            <w:r>
+              <w:t>Fresh Milk</w:t>
             </w:r>
           </w:p>
         </w:tc>
@@ -657,45 +501,19 @@
           <w:tcPr>
             <w:tcW w:w="2363" w:type="dxa"/>
           </w:tcPr>
-          <w:p>
-            <w:r>
-              <w:t>This was not appropriate to use to show a picture for a staff member called “Bob Smith”</w:t>
-            </w:r>
-            <w:r>
-              <w:t xml:space="preserve">. </w:t>
-            </w:r>
-            <w:r>
-              <w:t>Since, the picture is not professional which would be industry standard for other companies. Furthermore, it makes the staff look less trustworthy due to their outfit and their pose. This will result in corporate clients of the company to not do business with them.</w:t>
-            </w:r>
-          </w:p>
+          <w:p/>
         </w:tc>
         <w:tc>
           <w:tcPr>
             <w:tcW w:w="2126" w:type="dxa"/>
           </w:tcPr>
-          <w:p>
-            <w:r>
-              <w:t xml:space="preserve">The source was unreliable since it did not actually give the picture of actual staff working at </w:t>
-            </w:r>
-            <w:proofErr w:type="spellStart"/>
-            <w:r>
-              <w:t>CityPoint</w:t>
-            </w:r>
-            <w:proofErr w:type="spellEnd"/>
-            <w:r>
-              <w:t xml:space="preserve"> Room Hire. However, this does not matter for the solution as this is a prototype that is not going to be actually used by the company. But in the actual solution the source needs to be reliable, so the client does not deceive their customers.</w:t>
-            </w:r>
-          </w:p>
+          <w:p/>
         </w:tc>
         <w:tc>
           <w:tcPr>
             <w:tcW w:w="2268" w:type="dxa"/>
           </w:tcPr>
-          <w:p>
-            <w:r>
-              <w:t>This asset has the legal implication to be used freely except in logos, trademarks or to ruin the someone’s reputation. This has the ethical implication of not representing the actual person that the picture should be in the staff’s details.</w:t>
-            </w:r>
-          </w:p>
+          <w:p/>
         </w:tc>
       </w:tr>
       <w:tr>
@@ -709,74 +527,8 @@
                 <w:tab w:val="left" w:pos="2300"/>
               </w:tabs>
             </w:pPr>
-            <w:hyperlink r:id="rId11" w:history="1">
-              <w:r>
-                <w:rPr>
-                  <w:rStyle w:val="Hyperlink"/>
-                </w:rPr>
-                <w:t>https://pixabay.com/photos/portrait-man-basecamp-cap-dark-7676482/</w:t>
-              </w:r>
-            </w:hyperlink>
-          </w:p>
-          <w:p>
-            <w:pPr>
-              <w:tabs>
-                <w:tab w:val="left" w:pos="2300"/>
-              </w:tabs>
-            </w:pPr>
-            <w:r>
-              <w:rPr>
-                <w:noProof/>
-              </w:rPr>
-              <w:lastRenderedPageBreak/>
-              <w:drawing>
-                <wp:inline distT="0" distB="0" distL="0" distR="0" wp14:anchorId="6B5C30D7" wp14:editId="54365A1C">
-                  <wp:extent cx="2108579" cy="1405408"/>
-                  <wp:effectExtent l="0" t="0" r="6350" b="4445"/>
-                  <wp:docPr id="3" name="Picture 3"/>
-                  <wp:cNvGraphicFramePr>
-                    <a:graphicFrameLocks xmlns:a="http://schemas.openxmlformats.org/drawingml/2006/main" noChangeAspect="1"/>
-                  </wp:cNvGraphicFramePr>
-                  <a:graphic xmlns:a="http://schemas.openxmlformats.org/drawingml/2006/main">
-                    <a:graphicData uri="http://schemas.openxmlformats.org/drawingml/2006/picture">
-                      <pic:pic xmlns:pic="http://schemas.openxmlformats.org/drawingml/2006/picture">
-                        <pic:nvPicPr>
-                          <pic:cNvPr id="0" name="Picture 5"/>
-                          <pic:cNvPicPr>
-                            <a:picLocks noChangeAspect="1" noChangeArrowheads="1"/>
-                          </pic:cNvPicPr>
-                        </pic:nvPicPr>
-                        <pic:blipFill>
-                          <a:blip r:embed="rId12" cstate="print">
-                            <a:extLst>
-                              <a:ext uri="{28A0092B-C50C-407E-A947-70E740481C1C}">
-                                <a14:useLocalDpi xmlns:a14="http://schemas.microsoft.com/office/drawing/2010/main" val="0"/>
-                              </a:ext>
-                            </a:extLst>
-                          </a:blip>
-                          <a:srcRect/>
-                          <a:stretch>
-                            <a:fillRect/>
-                          </a:stretch>
-                        </pic:blipFill>
-                        <pic:spPr bwMode="auto">
-                          <a:xfrm>
-                            <a:off x="0" y="0"/>
-                            <a:ext cx="2116623" cy="1410770"/>
-                          </a:xfrm>
-                          <a:prstGeom prst="rect">
-                            <a:avLst/>
-                          </a:prstGeom>
-                          <a:noFill/>
-                          <a:ln>
-                            <a:noFill/>
-                          </a:ln>
-                        </pic:spPr>
-                      </pic:pic>
-                    </a:graphicData>
-                  </a:graphic>
-                </wp:inline>
-              </w:drawing>
+            <w:r>
+              <w:t>Seasonal Fruit Jam</w:t>
             </w:r>
           </w:p>
         </w:tc>
@@ -784,54 +536,19 @@
           <w:tcPr>
             <w:tcW w:w="2363" w:type="dxa"/>
           </w:tcPr>
-          <w:p>
-            <w:r>
-              <w:lastRenderedPageBreak/>
-              <w:t xml:space="preserve">This was not appropriate to use to show a picture for a staff member called “David Brown”. Since, the picture is not professional which would be industry standard for other </w:t>
-            </w:r>
-            <w:r>
-              <w:lastRenderedPageBreak/>
-              <w:t>companies. Furthermore, it makes the staff look less trustworthy due to their outfit and their pose. This will result in corporate clients of the company to not do business with them.</w:t>
-            </w:r>
-          </w:p>
+          <w:p/>
         </w:tc>
         <w:tc>
           <w:tcPr>
             <w:tcW w:w="2126" w:type="dxa"/>
           </w:tcPr>
-          <w:p>
-            <w:r>
-              <w:lastRenderedPageBreak/>
-              <w:t xml:space="preserve">The source was unreliable since it did not actually give the picture of actual staff working at </w:t>
-            </w:r>
-            <w:proofErr w:type="spellStart"/>
-            <w:r>
-              <w:t>CityPoint</w:t>
-            </w:r>
-            <w:proofErr w:type="spellEnd"/>
-            <w:r>
-              <w:t xml:space="preserve"> Room Hire. However, this does not matter for the solution as this is a </w:t>
-            </w:r>
-            <w:r>
-              <w:lastRenderedPageBreak/>
-              <w:t>prototype that is not going to be actually used by the company. But in the actual solution the source needs to be reliable, so the client does not deceive their customers.</w:t>
-            </w:r>
-          </w:p>
+          <w:p/>
         </w:tc>
         <w:tc>
           <w:tcPr>
             <w:tcW w:w="2268" w:type="dxa"/>
           </w:tcPr>
-          <w:p>
-            <w:r>
-              <w:lastRenderedPageBreak/>
-              <w:t xml:space="preserve">This asset has the legal implication to be used freely except in logos, trademarks or to ruin the someone’s reputation. This has the ethical implication of not representing the actual person that </w:t>
-            </w:r>
-            <w:r>
-              <w:lastRenderedPageBreak/>
-              <w:t>the picture should be in the staff’s details.</w:t>
-            </w:r>
-          </w:p>
+          <w:p/>
         </w:tc>
       </w:tr>
       <w:tr>
@@ -840,68 +557,8 @@
             <w:tcW w:w="3586" w:type="dxa"/>
           </w:tcPr>
           <w:p>
-            <w:hyperlink r:id="rId13" w:history="1">
-              <w:r>
-                <w:rPr>
-                  <w:rStyle w:val="Hyperlink"/>
-                </w:rPr>
-                <w:t>https://pixabay.com/photos/woman-blonde-portrait-model-lady-5639513/</w:t>
-              </w:r>
-            </w:hyperlink>
-          </w:p>
-          <w:p>
-            <w:r>
-              <w:rPr>
-                <w:noProof/>
-              </w:rPr>
-              <w:drawing>
-                <wp:inline distT="0" distB="0" distL="0" distR="0" wp14:anchorId="7B2E13BA" wp14:editId="56A0944D">
-                  <wp:extent cx="2108579" cy="1405408"/>
-                  <wp:effectExtent l="0" t="0" r="6350" b="4445"/>
-                  <wp:docPr id="4" name="Picture 4"/>
-                  <wp:cNvGraphicFramePr>
-                    <a:graphicFrameLocks xmlns:a="http://schemas.openxmlformats.org/drawingml/2006/main" noChangeAspect="1"/>
-                  </wp:cNvGraphicFramePr>
-                  <a:graphic xmlns:a="http://schemas.openxmlformats.org/drawingml/2006/main">
-                    <a:graphicData uri="http://schemas.openxmlformats.org/drawingml/2006/picture">
-                      <pic:pic xmlns:pic="http://schemas.openxmlformats.org/drawingml/2006/picture">
-                        <pic:nvPicPr>
-                          <pic:cNvPr id="0" name="Picture 7"/>
-                          <pic:cNvPicPr>
-                            <a:picLocks noChangeAspect="1" noChangeArrowheads="1"/>
-                          </pic:cNvPicPr>
-                        </pic:nvPicPr>
-                        <pic:blipFill>
-                          <a:blip r:embed="rId14" cstate="print">
-                            <a:extLst>
-                              <a:ext uri="{28A0092B-C50C-407E-A947-70E740481C1C}">
-                                <a14:useLocalDpi xmlns:a14="http://schemas.microsoft.com/office/drawing/2010/main" val="0"/>
-                              </a:ext>
-                            </a:extLst>
-                          </a:blip>
-                          <a:srcRect/>
-                          <a:stretch>
-                            <a:fillRect/>
-                          </a:stretch>
-                        </pic:blipFill>
-                        <pic:spPr bwMode="auto">
-                          <a:xfrm>
-                            <a:off x="0" y="0"/>
-                            <a:ext cx="2127292" cy="1417881"/>
-                          </a:xfrm>
-                          <a:prstGeom prst="rect">
-                            <a:avLst/>
-                          </a:prstGeom>
-                          <a:noFill/>
-                          <a:ln>
-                            <a:noFill/>
-                          </a:ln>
-                        </pic:spPr>
-                      </pic:pic>
-                    </a:graphicData>
-                  </a:graphic>
-                </wp:inline>
-              </w:drawing>
+            <w:r>
+              <w:t>sophie</w:t>
             </w:r>
           </w:p>
         </w:tc>
@@ -909,48 +566,409 @@
           <w:tcPr>
             <w:tcW w:w="2363" w:type="dxa"/>
           </w:tcPr>
-          <w:p>
-            <w:r>
-              <w:t>This was not appropriate to use to show a picture for a staff member called “</w:t>
-            </w:r>
-            <w:r>
-              <w:t>Catherine Lee</w:t>
-            </w:r>
-            <w:r>
-              <w:t xml:space="preserve">. </w:t>
-            </w:r>
-            <w:r>
-              <w:t>Since, the picture is not professional which would be industry standard for other companies. Furthermore, it makes the staff look less trustworthy due to their outfit and their pose. This will result in corporate clients of the company to not do business with them.</w:t>
-            </w:r>
-          </w:p>
+          <w:p/>
         </w:tc>
         <w:tc>
           <w:tcPr>
             <w:tcW w:w="2126" w:type="dxa"/>
           </w:tcPr>
-          <w:p>
-            <w:r>
-              <w:t xml:space="preserve">The source was unreliable since it did not actually give the picture of actual staff working at </w:t>
-            </w:r>
-            <w:proofErr w:type="spellStart"/>
-            <w:r>
-              <w:t>CityPoint</w:t>
-            </w:r>
-            <w:proofErr w:type="spellEnd"/>
-            <w:r>
-              <w:t xml:space="preserve"> Room Hire. However, this does not matter for the solution as this is a prototype that is not going to be actually used by the company. But in the actual solution the source needs to be reliable, so the client does not deceive their customers.</w:t>
-            </w:r>
-          </w:p>
+          <w:p/>
         </w:tc>
         <w:tc>
           <w:tcPr>
             <w:tcW w:w="2268" w:type="dxa"/>
           </w:tcPr>
-          <w:p>
-            <w:r>
-              <w:t>This asset has the legal implication to be used freely except in logos, trademarks or to ruin the someone’s reputation. This has the ethical implication of not representing the actual person that the picture should be in the staff’s details.</w:t>
-            </w:r>
-          </w:p>
+          <w:p/>
+        </w:tc>
+      </w:tr>
+      <w:tr>
+        <w:tc>
+          <w:tcPr>
+            <w:tcW w:w="3586" w:type="dxa"/>
+          </w:tcPr>
+          <w:p>
+            <w:r>
+              <w:t>charlotte</w:t>
+            </w:r>
+          </w:p>
+        </w:tc>
+        <w:tc>
+          <w:tcPr>
+            <w:tcW w:w="2363" w:type="dxa"/>
+          </w:tcPr>
+          <w:p/>
+        </w:tc>
+        <w:tc>
+          <w:tcPr>
+            <w:tcW w:w="2126" w:type="dxa"/>
+          </w:tcPr>
+          <w:p/>
+        </w:tc>
+        <w:tc>
+          <w:tcPr>
+            <w:tcW w:w="2268" w:type="dxa"/>
+          </w:tcPr>
+          <w:p/>
+        </w:tc>
+      </w:tr>
+      <w:tr>
+        <w:tc>
+          <w:tcPr>
+            <w:tcW w:w="3586" w:type="dxa"/>
+          </w:tcPr>
+          <w:p>
+            <w:r>
+              <w:t>emily</w:t>
+            </w:r>
+          </w:p>
+        </w:tc>
+        <w:tc>
+          <w:tcPr>
+            <w:tcW w:w="2363" w:type="dxa"/>
+          </w:tcPr>
+          <w:p/>
+        </w:tc>
+        <w:tc>
+          <w:tcPr>
+            <w:tcW w:w="2126" w:type="dxa"/>
+          </w:tcPr>
+          <w:p/>
+        </w:tc>
+        <w:tc>
+          <w:tcPr>
+            <w:tcW w:w="2268" w:type="dxa"/>
+          </w:tcPr>
+          <w:p/>
+        </w:tc>
+      </w:tr>
+      <w:tr>
+        <w:tc>
+          <w:tcPr>
+            <w:tcW w:w="3586" w:type="dxa"/>
+          </w:tcPr>
+          <w:p>
+            <w:r>
+              <w:t>hero_image</w:t>
+            </w:r>
+          </w:p>
+        </w:tc>
+        <w:tc>
+          <w:tcPr>
+            <w:tcW w:w="2363" w:type="dxa"/>
+          </w:tcPr>
+          <w:p/>
+        </w:tc>
+        <w:tc>
+          <w:tcPr>
+            <w:tcW w:w="2126" w:type="dxa"/>
+          </w:tcPr>
+          <w:p/>
+        </w:tc>
+        <w:tc>
+          <w:tcPr>
+            <w:tcW w:w="2268" w:type="dxa"/>
+          </w:tcPr>
+          <w:p/>
+        </w:tc>
+      </w:tr>
+      <w:tr>
+        <w:tc>
+          <w:tcPr>
+            <w:tcW w:w="3586" w:type="dxa"/>
+          </w:tcPr>
+          <w:p>
+            <w:r>
+              <w:t>cta_image</w:t>
+            </w:r>
+          </w:p>
+        </w:tc>
+        <w:tc>
+          <w:tcPr>
+            <w:tcW w:w="2363" w:type="dxa"/>
+          </w:tcPr>
+          <w:p/>
+        </w:tc>
+        <w:tc>
+          <w:tcPr>
+            <w:tcW w:w="2126" w:type="dxa"/>
+          </w:tcPr>
+          <w:p/>
+        </w:tc>
+        <w:tc>
+          <w:tcPr>
+            <w:tcW w:w="2268" w:type="dxa"/>
+          </w:tcPr>
+          <w:p/>
+        </w:tc>
+      </w:tr>
+      <w:tr>
+        <w:tc>
+          <w:tcPr>
+            <w:tcW w:w="3586" w:type="dxa"/>
+          </w:tcPr>
+          <w:p>
+            <w:r>
+              <w:t>shopping-cart</w:t>
+            </w:r>
+          </w:p>
+        </w:tc>
+        <w:tc>
+          <w:tcPr>
+            <w:tcW w:w="2363" w:type="dxa"/>
+          </w:tcPr>
+          <w:p/>
+        </w:tc>
+        <w:tc>
+          <w:tcPr>
+            <w:tcW w:w="2126" w:type="dxa"/>
+          </w:tcPr>
+          <w:p/>
+        </w:tc>
+        <w:tc>
+          <w:tcPr>
+            <w:tcW w:w="2268" w:type="dxa"/>
+          </w:tcPr>
+          <w:p/>
+        </w:tc>
+      </w:tr>
+      <w:tr>
+        <w:tc>
+          <w:tcPr>
+            <w:tcW w:w="3586" w:type="dxa"/>
+          </w:tcPr>
+          <w:p>
+            <w:r>
+              <w:t>Hero section slogan</w:t>
+            </w:r>
+          </w:p>
+        </w:tc>
+        <w:tc>
+          <w:tcPr>
+            <w:tcW w:w="2363" w:type="dxa"/>
+          </w:tcPr>
+          <w:p/>
+        </w:tc>
+        <w:tc>
+          <w:tcPr>
+            <w:tcW w:w="2126" w:type="dxa"/>
+          </w:tcPr>
+          <w:p/>
+        </w:tc>
+        <w:tc>
+          <w:tcPr>
+            <w:tcW w:w="2268" w:type="dxa"/>
+          </w:tcPr>
+          <w:p/>
+        </w:tc>
+      </w:tr>
+      <w:tr>
+        <w:tc>
+          <w:tcPr>
+            <w:tcW w:w="3586" w:type="dxa"/>
+          </w:tcPr>
+          <w:p>
+            <w:r>
+              <w:t>‘Why buy locally?’ information</w:t>
+            </w:r>
+          </w:p>
+        </w:tc>
+        <w:tc>
+          <w:tcPr>
+            <w:tcW w:w="2363" w:type="dxa"/>
+          </w:tcPr>
+          <w:p/>
+        </w:tc>
+        <w:tc>
+          <w:tcPr>
+            <w:tcW w:w="2126" w:type="dxa"/>
+          </w:tcPr>
+          <w:p/>
+        </w:tc>
+        <w:tc>
+          <w:tcPr>
+            <w:tcW w:w="2268" w:type="dxa"/>
+          </w:tcPr>
+          <w:p/>
+        </w:tc>
+      </w:tr>
+      <w:tr>
+        <w:tc>
+          <w:tcPr>
+            <w:tcW w:w="3586" w:type="dxa"/>
+          </w:tcPr>
+          <w:p>
+            <w:r>
+              <w:t>Sophie’s details</w:t>
+            </w:r>
+          </w:p>
+        </w:tc>
+        <w:tc>
+          <w:tcPr>
+            <w:tcW w:w="2363" w:type="dxa"/>
+          </w:tcPr>
+          <w:p/>
+        </w:tc>
+        <w:tc>
+          <w:tcPr>
+            <w:tcW w:w="2126" w:type="dxa"/>
+          </w:tcPr>
+          <w:p/>
+        </w:tc>
+        <w:tc>
+          <w:tcPr>
+            <w:tcW w:w="2268" w:type="dxa"/>
+          </w:tcPr>
+          <w:p/>
+        </w:tc>
+      </w:tr>
+      <w:tr>
+        <w:tc>
+          <w:tcPr>
+            <w:tcW w:w="3586" w:type="dxa"/>
+          </w:tcPr>
+          <w:p>
+            <w:r>
+              <w:t>Emily’s details</w:t>
+            </w:r>
+          </w:p>
+        </w:tc>
+        <w:tc>
+          <w:tcPr>
+            <w:tcW w:w="2363" w:type="dxa"/>
+          </w:tcPr>
+          <w:p/>
+        </w:tc>
+        <w:tc>
+          <w:tcPr>
+            <w:tcW w:w="2126" w:type="dxa"/>
+          </w:tcPr>
+          <w:p/>
+        </w:tc>
+        <w:tc>
+          <w:tcPr>
+            <w:tcW w:w="2268" w:type="dxa"/>
+          </w:tcPr>
+          <w:p/>
+        </w:tc>
+      </w:tr>
+      <w:tr>
+        <w:tc>
+          <w:tcPr>
+            <w:tcW w:w="3586" w:type="dxa"/>
+          </w:tcPr>
+          <w:p>
+            <w:r>
+              <w:t>Charlotte’s details</w:t>
+            </w:r>
+          </w:p>
+        </w:tc>
+        <w:tc>
+          <w:tcPr>
+            <w:tcW w:w="2363" w:type="dxa"/>
+          </w:tcPr>
+          <w:p/>
+        </w:tc>
+        <w:tc>
+          <w:tcPr>
+            <w:tcW w:w="2126" w:type="dxa"/>
+          </w:tcPr>
+          <w:p/>
+        </w:tc>
+        <w:tc>
+          <w:tcPr>
+            <w:tcW w:w="2268" w:type="dxa"/>
+          </w:tcPr>
+          <w:p/>
+        </w:tc>
+      </w:tr>
+      <w:tr>
+        <w:tc>
+          <w:tcPr>
+            <w:tcW w:w="3586" w:type="dxa"/>
+          </w:tcPr>
+          <w:p>
+            <w:r>
+              <w:t>Organic Carrots details</w:t>
+            </w:r>
+          </w:p>
+        </w:tc>
+        <w:tc>
+          <w:tcPr>
+            <w:tcW w:w="2363" w:type="dxa"/>
+          </w:tcPr>
+          <w:p/>
+        </w:tc>
+        <w:tc>
+          <w:tcPr>
+            <w:tcW w:w="2126" w:type="dxa"/>
+          </w:tcPr>
+          <w:p/>
+        </w:tc>
+        <w:tc>
+          <w:tcPr>
+            <w:tcW w:w="2268" w:type="dxa"/>
+          </w:tcPr>
+          <w:p/>
+        </w:tc>
+      </w:tr>
+      <w:tr>
+        <w:tc>
+          <w:tcPr>
+            <w:tcW w:w="3586" w:type="dxa"/>
+          </w:tcPr>
+          <w:p>
+            <w:r>
+              <w:t>Fresh Milk details</w:t>
+            </w:r>
+          </w:p>
+        </w:tc>
+        <w:tc>
+          <w:tcPr>
+            <w:tcW w:w="2363" w:type="dxa"/>
+          </w:tcPr>
+          <w:p/>
+        </w:tc>
+        <w:tc>
+          <w:tcPr>
+            <w:tcW w:w="2126" w:type="dxa"/>
+          </w:tcPr>
+          <w:p/>
+        </w:tc>
+        <w:tc>
+          <w:tcPr>
+            <w:tcW w:w="2268" w:type="dxa"/>
+          </w:tcPr>
+          <w:p/>
+        </w:tc>
+      </w:tr>
+      <w:tr>
+        <w:tc>
+          <w:tcPr>
+            <w:tcW w:w="3586" w:type="dxa"/>
+          </w:tcPr>
+          <w:p>
+            <w:r>
+              <w:t>Seasonal Fruit Jam details</w:t>
+            </w:r>
+          </w:p>
+        </w:tc>
+        <w:tc>
+          <w:tcPr>
+            <w:tcW w:w="2363" w:type="dxa"/>
+          </w:tcPr>
+          <w:p/>
+        </w:tc>
+        <w:tc>
+          <w:tcPr>
+            <w:tcW w:w="2126" w:type="dxa"/>
+          </w:tcPr>
+          <w:p/>
+        </w:tc>
+        <w:tc>
+          <w:tcPr>
+            <w:tcW w:w="2268" w:type="dxa"/>
+          </w:tcPr>
+          <w:p/>
         </w:tc>
       </w:tr>
     </w:tbl>
@@ -967,13 +985,11 @@
       <w:r>
         <w:t xml:space="preserve">The overall prototype met most of the original requirements for the solution for </w:t>
       </w:r>
-      <w:proofErr w:type="spellStart"/>
       <w:r>
-        <w:t>CityPoint</w:t>
+        <w:t>Greenfield Local Hub.</w:t>
       </w:r>
-      <w:proofErr w:type="spellEnd"/>
       <w:r>
-        <w:t xml:space="preserve"> Room Hire. It was only mostly met as some features do not functional or functional differently from the requirements that were proposed initially to the client.</w:t>
+        <w:t xml:space="preserve"> It was only mostly met as some features do not functional or functional differently from the requirements that were proposed initially to the client.</w:t>
       </w:r>
     </w:p>
     <w:p>
@@ -987,12 +1003,12 @@
     <w:tbl>
       <w:tblPr>
         <w:tblStyle w:val="TableGrid"/>
-        <w:tblW w:w="0" w:type="auto"/>
+        <w:tblW w:w="9824" w:type="dxa"/>
         <w:tblLook w:val="04A0" w:firstRow="1" w:lastRow="0" w:firstColumn="1" w:lastColumn="0" w:noHBand="0" w:noVBand="1"/>
       </w:tblPr>
       <w:tblGrid>
         <w:gridCol w:w="3245"/>
-        <w:gridCol w:w="1003"/>
+        <w:gridCol w:w="1091"/>
         <w:gridCol w:w="5488"/>
       </w:tblGrid>
       <w:tr>
@@ -1008,7 +1024,7 @@
         </w:tc>
         <w:tc>
           <w:tcPr>
-            <w:tcW w:w="1003" w:type="dxa"/>
+            <w:tcW w:w="1091" w:type="dxa"/>
           </w:tcPr>
           <w:p>
             <w:r>
@@ -1047,7 +1063,7 @@
         </w:tc>
         <w:tc>
           <w:tcPr>
-            <w:tcW w:w="1003" w:type="dxa"/>
+            <w:tcW w:w="1091" w:type="dxa"/>
           </w:tcPr>
           <w:p>
             <w:r>
@@ -1061,7 +1077,13 @@
           </w:tcPr>
           <w:p>
             <w:r>
-              <w:t>This is met fully because users are able to register accounts easily by either typing in the email and password or using Google to create an account.</w:t>
+              <w:t xml:space="preserve">This is met fully because users </w:t>
+            </w:r>
+            <w:r>
+              <w:t>can</w:t>
+            </w:r>
+            <w:r>
+              <w:t xml:space="preserve"> register accounts easily by either typing in the email and password or using Google to create an account.</w:t>
             </w:r>
           </w:p>
         </w:tc>
@@ -1076,17 +1098,13 @@
               <w:pStyle w:val="Default"/>
             </w:pPr>
             <w:r>
-              <w:rPr>
-                <w:sz w:val="22"/>
-                <w:szCs w:val="22"/>
-              </w:rPr>
-              <w:t xml:space="preserve">Users able to log in </w:t>
-            </w:r>
-          </w:p>
-        </w:tc>
-        <w:tc>
-          <w:tcPr>
-            <w:tcW w:w="1003" w:type="dxa"/>
+              <w:t>Users able to log in</w:t>
+            </w:r>
+          </w:p>
+        </w:tc>
+        <w:tc>
+          <w:tcPr>
+            <w:tcW w:w="1091" w:type="dxa"/>
           </w:tcPr>
           <w:p>
             <w:r>
@@ -1098,11 +1116,7 @@
           <w:tcPr>
             <w:tcW w:w="5488" w:type="dxa"/>
           </w:tcPr>
-          <w:p>
-            <w:r>
-              <w:t>This is met fully because users can log in to their account that they created using their manually created account or using Google.</w:t>
-            </w:r>
-          </w:p>
+          <w:p/>
         </w:tc>
       </w:tr>
       <w:tr>
@@ -1115,17 +1129,13 @@
               <w:pStyle w:val="Default"/>
             </w:pPr>
             <w:r>
-              <w:rPr>
-                <w:sz w:val="22"/>
-                <w:szCs w:val="22"/>
-              </w:rPr>
               <w:t>Users able to change their log in details</w:t>
             </w:r>
           </w:p>
         </w:tc>
         <w:tc>
           <w:tcPr>
-            <w:tcW w:w="1003" w:type="dxa"/>
+            <w:tcW w:w="1091" w:type="dxa"/>
           </w:tcPr>
           <w:p>
             <w:r>
@@ -1137,20 +1147,7 @@
           <w:tcPr>
             <w:tcW w:w="5488" w:type="dxa"/>
           </w:tcPr>
-          <w:p>
-            <w:r>
-              <w:t>This is met fully as users can navigate to their profile where they can</w:t>
-            </w:r>
-            <w:r>
-              <w:t xml:space="preserve"> change</w:t>
-            </w:r>
-            <w:r>
-              <w:t xml:space="preserve"> their email</w:t>
-            </w:r>
-            <w:r>
-              <w:t xml:space="preserve"> and password.</w:t>
-            </w:r>
-          </w:p>
+          <w:p/>
         </w:tc>
       </w:tr>
       <w:tr>
@@ -1163,17 +1160,41 @@
               <w:pStyle w:val="Default"/>
             </w:pPr>
             <w:r>
-              <w:rPr>
-                <w:sz w:val="22"/>
-                <w:szCs w:val="22"/>
-              </w:rPr>
               <w:t>Users able to view privacy information</w:t>
             </w:r>
           </w:p>
         </w:tc>
         <w:tc>
           <w:tcPr>
-            <w:tcW w:w="1003" w:type="dxa"/>
+            <w:tcW w:w="1091" w:type="dxa"/>
+          </w:tcPr>
+          <w:p>
+            <w:r>
+              <w:t>Yes</w:t>
+            </w:r>
+          </w:p>
+        </w:tc>
+        <w:tc>
+          <w:tcPr>
+            <w:tcW w:w="5488" w:type="dxa"/>
+          </w:tcPr>
+          <w:p/>
+        </w:tc>
+      </w:tr>
+      <w:tr>
+        <w:tc>
+          <w:tcPr>
+            <w:tcW w:w="3245" w:type="dxa"/>
+          </w:tcPr>
+          <w:p>
+            <w:r>
+              <w:t>Users able to view information about the producers, their methods and the benefits of buying locally</w:t>
+            </w:r>
+          </w:p>
+        </w:tc>
+        <w:tc>
+          <w:tcPr>
+            <w:tcW w:w="1091" w:type="dxa"/>
           </w:tcPr>
           <w:p>
             <w:r>
@@ -1185,24 +1206,88 @@
           <w:tcPr>
             <w:tcW w:w="5488" w:type="dxa"/>
           </w:tcPr>
-          <w:p>
-            <w:r>
-              <w:t xml:space="preserve">This was not met fully since users can only view the privacy policies’ page, but it does not outline any privacy policies. There is only placeholder text put there for testing purpose and this will not be useful for customers. </w:t>
-            </w:r>
+          <w:p/>
+        </w:tc>
+      </w:tr>
+      <w:tr>
+        <w:tc>
+          <w:tcPr>
+            <w:tcW w:w="3245" w:type="dxa"/>
+          </w:tcPr>
+          <w:p>
+            <w:r>
+              <w:t>Customers able to view products with transparent pricing and availability</w:t>
+            </w:r>
+          </w:p>
+        </w:tc>
+        <w:tc>
+          <w:tcPr>
+            <w:tcW w:w="1091" w:type="dxa"/>
+          </w:tcPr>
+          <w:p>
+            <w:r>
+              <w:t>Yes</w:t>
+            </w:r>
+          </w:p>
+        </w:tc>
+        <w:tc>
+          <w:tcPr>
+            <w:tcW w:w="5488" w:type="dxa"/>
+          </w:tcPr>
+          <w:p/>
+        </w:tc>
+      </w:tr>
+      <w:tr>
+        <w:tc>
+          <w:tcPr>
+            <w:tcW w:w="3245" w:type="dxa"/>
+          </w:tcPr>
+          <w:p>
+            <w:r>
+              <w:t>Customers able to place orders for collection or delivery</w:t>
+            </w:r>
+          </w:p>
+        </w:tc>
+        <w:tc>
+          <w:tcPr>
+            <w:tcW w:w="1091" w:type="dxa"/>
+          </w:tcPr>
+          <w:p>
+            <w:r>
+              <w:t>Yes</w:t>
+            </w:r>
+          </w:p>
+        </w:tc>
+        <w:tc>
+          <w:tcPr>
+            <w:tcW w:w="5488" w:type="dxa"/>
+          </w:tcPr>
+          <w:p/>
+        </w:tc>
+      </w:tr>
+      <w:tr>
+        <w:tc>
+          <w:tcPr>
+            <w:tcW w:w="3245" w:type="dxa"/>
+          </w:tcPr>
+          <w:p>
             <w:r>
               <w:lastRenderedPageBreak/>
-              <w:t xml:space="preserve">This can lead to the company getting fined as they are required to show this information on the website according to GDPR and other laws. Furthermore, it is not designed to show rules in a structured manner, which means the page or the website will not align with WCAG. This can result in </w:t>
-            </w:r>
-            <w:r>
-              <w:t>less</w:t>
-            </w:r>
-            <w:r>
-              <w:t xml:space="preserve"> users wanting to use the client’s services</w:t>
-            </w:r>
-            <w:r>
-              <w:t>.</w:t>
-            </w:r>
-          </w:p>
+              <w:t>Customers able to view order history</w:t>
+            </w:r>
+          </w:p>
+        </w:tc>
+        <w:tc>
+          <w:tcPr>
+            <w:tcW w:w="1091" w:type="dxa"/>
+          </w:tcPr>
+          <w:p/>
+        </w:tc>
+        <w:tc>
+          <w:tcPr>
+            <w:tcW w:w="5488" w:type="dxa"/>
+          </w:tcPr>
+          <w:p/>
         </w:tc>
       </w:tr>
       <w:tr>
@@ -1212,14 +1297,41 @@
           </w:tcPr>
           <w:p>
             <w:r>
-              <w:lastRenderedPageBreak/>
-              <w:t>Users able to view booking policies and staff details for the company</w:t>
-            </w:r>
-          </w:p>
-        </w:tc>
-        <w:tc>
-          <w:tcPr>
-            <w:tcW w:w="1003" w:type="dxa"/>
+              <w:t>Provide a dashboard for producers</w:t>
+            </w:r>
+          </w:p>
+        </w:tc>
+        <w:tc>
+          <w:tcPr>
+            <w:tcW w:w="1091" w:type="dxa"/>
+          </w:tcPr>
+          <w:p>
+            <w:r>
+              <w:t>Yes</w:t>
+            </w:r>
+          </w:p>
+        </w:tc>
+        <w:tc>
+          <w:tcPr>
+            <w:tcW w:w="5488" w:type="dxa"/>
+          </w:tcPr>
+          <w:p/>
+        </w:tc>
+      </w:tr>
+      <w:tr>
+        <w:tc>
+          <w:tcPr>
+            <w:tcW w:w="3245" w:type="dxa"/>
+          </w:tcPr>
+          <w:p>
+            <w:r>
+              <w:t>Provide order management, scheduling and tracking features</w:t>
+            </w:r>
+          </w:p>
+        </w:tc>
+        <w:tc>
+          <w:tcPr>
+            <w:tcW w:w="1091" w:type="dxa"/>
           </w:tcPr>
           <w:p>
             <w:r>
@@ -1231,37 +1343,7 @@
           <w:tcPr>
             <w:tcW w:w="5488" w:type="dxa"/>
           </w:tcPr>
-          <w:p>
-            <w:r>
-              <w:t xml:space="preserve">This was not met fully since users can only view the </w:t>
-            </w:r>
-            <w:r>
-              <w:t>booking</w:t>
-            </w:r>
-            <w:r>
-              <w:t xml:space="preserve"> policies’ page, but it does not outline any </w:t>
-            </w:r>
-            <w:r>
-              <w:t>booking</w:t>
-            </w:r>
-            <w:r>
-              <w:t xml:space="preserve"> policies.</w:t>
-            </w:r>
-            <w:r>
-              <w:t xml:space="preserve"> This will mean the website will go against Consumer Protection Act and make the users less trustworthy or confident when using the website. On the other hand, users can view the staff details fully, but the current staff details are placeholder and therefore would be needed to be replaced with actual details. This will do to ensure that the customers do not feel deceived, since false information is being used for the staff working at </w:t>
-            </w:r>
-            <w:proofErr w:type="spellStart"/>
-            <w:r>
-              <w:t>CityPoint</w:t>
-            </w:r>
-            <w:proofErr w:type="spellEnd"/>
-            <w:r>
-              <w:t xml:space="preserve"> Room Hire. Furthermore, more details can be added on like contact details</w:t>
-            </w:r>
-            <w:r>
-              <w:t>, so the staff can be contacted by customers, if needed.</w:t>
-            </w:r>
-          </w:p>
+          <w:p/>
         </w:tc>
       </w:tr>
       <w:tr>
@@ -1271,13 +1353,13 @@
           </w:tcPr>
           <w:p>
             <w:r>
-              <w:t>Users able to view rooms/facilities information</w:t>
-            </w:r>
-          </w:p>
-        </w:tc>
-        <w:tc>
-          <w:tcPr>
-            <w:tcW w:w="1003" w:type="dxa"/>
+              <w:t>A loyalty scheme that provides discounts and specials offers</w:t>
+            </w:r>
+          </w:p>
+        </w:tc>
+        <w:tc>
+          <w:tcPr>
+            <w:tcW w:w="1091" w:type="dxa"/>
           </w:tcPr>
           <w:p>
             <w:r>
@@ -1289,11 +1371,7 @@
           <w:tcPr>
             <w:tcW w:w="5488" w:type="dxa"/>
           </w:tcPr>
-          <w:p>
-            <w:r>
-              <w:t>This is met fully as users can view all the information about a room when they are making a booking. Even when searching for rooms, the most important information can be also viewed easily by users. The rooms information can also be viewed in the home page under the room’s sections.</w:t>
-            </w:r>
-          </w:p>
+          <w:p/>
         </w:tc>
       </w:tr>
       <w:tr>
@@ -1303,17 +1381,17 @@
           </w:tcPr>
           <w:p>
             <w:r>
-              <w:t>User able to book rooms and manage bookings</w:t>
-            </w:r>
-          </w:p>
-        </w:tc>
-        <w:tc>
-          <w:tcPr>
-            <w:tcW w:w="1003" w:type="dxa"/>
-          </w:tcPr>
-          <w:p>
-            <w:r>
-              <w:t>Not fully</w:t>
+              <w:t>Users able to change the application according to their accessibility needs</w:t>
+            </w:r>
+          </w:p>
+        </w:tc>
+        <w:tc>
+          <w:tcPr>
+            <w:tcW w:w="1091" w:type="dxa"/>
+          </w:tcPr>
+          <w:p>
+            <w:r>
+              <w:t>No</w:t>
             </w:r>
           </w:p>
         </w:tc>
@@ -1321,26 +1399,7 @@
           <w:tcPr>
             <w:tcW w:w="5488" w:type="dxa"/>
           </w:tcPr>
-          <w:p>
-            <w:r>
-              <w:t>This was not met fully since users cannot fully manage bookings. This is due to them not having the access to deleting bookings or having an easy way to manage multiple bookings at once. For example</w:t>
-            </w:r>
-            <w:r>
-              <w:t>,</w:t>
-            </w:r>
-            <w:r>
-              <w:t xml:space="preserve"> deleting multiple bookings at once</w:t>
-            </w:r>
-            <w:r>
-              <w:t>,</w:t>
-            </w:r>
-            <w:r>
-              <w:t xml:space="preserve"> or filtering</w:t>
-            </w:r>
-            <w:r>
-              <w:t xml:space="preserve"> them by search or specific filters. Furthermore, the users cannot view their booking status, which will be frustrating and lead to users not using the solution to use the company’s services.</w:t>
-            </w:r>
-          </w:p>
+          <w:p/>
         </w:tc>
       </w:tr>
       <w:tr>
@@ -1350,17 +1409,20 @@
           </w:tcPr>
           <w:p>
             <w:r>
-              <w:t>Staff able to manage rooms or bookings requests</w:t>
-            </w:r>
-          </w:p>
-        </w:tc>
-        <w:tc>
-          <w:tcPr>
-            <w:tcW w:w="1003" w:type="dxa"/>
-          </w:tcPr>
-          <w:p>
-            <w:r>
-              <w:t>Not fully</w:t>
+              <w:t>Add access control pages based on user roles</w:t>
+            </w:r>
+          </w:p>
+        </w:tc>
+        <w:tc>
+          <w:tcPr>
+            <w:tcW w:w="1091" w:type="dxa"/>
+          </w:tcPr>
+          <w:p>
+            <w:r>
+              <w:t>Y</w:t>
+            </w:r>
+            <w:r>
+              <w:t>es</w:t>
             </w:r>
           </w:p>
         </w:tc>
@@ -1368,28 +1430,7 @@
           <w:tcPr>
             <w:tcW w:w="5488" w:type="dxa"/>
           </w:tcPr>
-          <w:p>
-            <w:r>
-              <w:t xml:space="preserve">This was not fully met because staff cannot manage rooms fully as they are unable to create new rooms, due to controller logic not being configured appropriately to allow to make new rooms. Furthermore, the staff does not have link to the page where they can create new rooms, which is another reason they cannot make new rooms. This will be bad for the company as they cannot </w:t>
-            </w:r>
-            <w:r>
-              <w:t xml:space="preserve">add </w:t>
-            </w:r>
-            <w:r>
-              <w:t xml:space="preserve">new room options to the solution </w:t>
-            </w:r>
-            <w:r>
-              <w:t xml:space="preserve">and therefore reduce earning capacity for </w:t>
-            </w:r>
-            <w:proofErr w:type="spellStart"/>
-            <w:r>
-              <w:t>CityPoint</w:t>
-            </w:r>
-            <w:proofErr w:type="spellEnd"/>
-            <w:r>
-              <w:t xml:space="preserve"> Room Hire.</w:t>
-            </w:r>
-          </w:p>
+          <w:p/>
         </w:tc>
       </w:tr>
     </w:tbl>
@@ -1401,7 +1442,6 @@
         <w:pStyle w:val="Heading2"/>
       </w:pPr>
       <w:r>
-        <w:lastRenderedPageBreak/>
         <w:t>Non-Functional Requirements</w:t>
       </w:r>
     </w:p>
@@ -1416,14 +1456,14 @@
     <w:tbl>
       <w:tblPr>
         <w:tblStyle w:val="TableGrid"/>
-        <w:tblW w:w="0" w:type="auto"/>
+        <w:tblW w:w="9634" w:type="dxa"/>
         <w:tblLook w:val="04A0" w:firstRow="1" w:lastRow="0" w:firstColumn="1" w:lastColumn="0" w:noHBand="0" w:noVBand="1"/>
       </w:tblPr>
       <w:tblGrid>
         <w:gridCol w:w="2116"/>
         <w:gridCol w:w="2951"/>
-        <w:gridCol w:w="2401"/>
-        <w:gridCol w:w="2268"/>
+        <w:gridCol w:w="1024"/>
+        <w:gridCol w:w="3543"/>
       </w:tblGrid>
       <w:tr>
         <w:tc>
@@ -1468,7 +1508,7 @@
         </w:tc>
         <w:tc>
           <w:tcPr>
-            <w:tcW w:w="2401" w:type="dxa"/>
+            <w:tcW w:w="1024" w:type="dxa"/>
           </w:tcPr>
           <w:p>
             <w:pPr>
@@ -1488,7 +1528,7 @@
         </w:tc>
         <w:tc>
           <w:tcPr>
-            <w:tcW w:w="2268" w:type="dxa"/>
+            <w:tcW w:w="3543" w:type="dxa"/>
           </w:tcPr>
           <w:p>
             <w:pPr>
@@ -1524,13 +1564,142 @@
           </w:tcPr>
           <w:p>
             <w:r>
-              <w:t>Webpages should load within 15 milliseconds.</w:t>
-            </w:r>
-          </w:p>
-        </w:tc>
-        <w:tc>
-          <w:tcPr>
-            <w:tcW w:w="2401" w:type="dxa"/>
+              <w:t>Webpages containing just text should load within 15 milliseconds.</w:t>
+            </w:r>
+          </w:p>
+          <w:p>
+            <w:r>
+              <w:t>Webpages containing less than 20 high quality images should load within 30 milliseconds.</w:t>
+            </w:r>
+          </w:p>
+          <w:p>
+            <w:r>
+              <w:t>Webpages containing more than 30 high quality images should load within 50 milliseconds.</w:t>
+            </w:r>
+          </w:p>
+        </w:tc>
+        <w:tc>
+          <w:tcPr>
+            <w:tcW w:w="1024" w:type="dxa"/>
+          </w:tcPr>
+          <w:p>
+            <w:r>
+              <w:t>Yes</w:t>
+            </w:r>
+          </w:p>
+        </w:tc>
+        <w:tc>
+          <w:tcPr>
+            <w:tcW w:w="3543" w:type="dxa"/>
+          </w:tcPr>
+          <w:p/>
+        </w:tc>
+      </w:tr>
+      <w:tr>
+        <w:tc>
+          <w:tcPr>
+            <w:tcW w:w="2116" w:type="dxa"/>
+          </w:tcPr>
+          <w:p>
+            <w:r>
+              <w:t>The system must handle a specific number of requests without degradation.</w:t>
+            </w:r>
+          </w:p>
+        </w:tc>
+        <w:tc>
+          <w:tcPr>
+            <w:tcW w:w="2951" w:type="dxa"/>
+          </w:tcPr>
+          <w:p>
+            <w:r>
+              <w:t>On average the system should handle 30 requests per second without degradation.</w:t>
+            </w:r>
+          </w:p>
+        </w:tc>
+        <w:tc>
+          <w:tcPr>
+            <w:tcW w:w="1024" w:type="dxa"/>
+          </w:tcPr>
+          <w:p>
+            <w:r>
+              <w:t>Yes</w:t>
+            </w:r>
+          </w:p>
+        </w:tc>
+        <w:tc>
+          <w:tcPr>
+            <w:tcW w:w="3543" w:type="dxa"/>
+          </w:tcPr>
+          <w:p/>
+        </w:tc>
+      </w:tr>
+      <w:tr>
+        <w:tc>
+          <w:tcPr>
+            <w:tcW w:w="2116" w:type="dxa"/>
+          </w:tcPr>
+          <w:p>
+            <w:r>
+              <w:t>CPU usage should not exceed a set amount</w:t>
+            </w:r>
+          </w:p>
+        </w:tc>
+        <w:tc>
+          <w:tcPr>
+            <w:tcW w:w="2951" w:type="dxa"/>
+          </w:tcPr>
+          <w:p>
+            <w:r>
+              <w:t>CPU usage should be under 20% on a S20 phone.</w:t>
+            </w:r>
+          </w:p>
+          <w:p>
+            <w:r>
+              <w:t>CPU usage should be under 15% on iPhone15 Pro Max.</w:t>
+            </w:r>
+          </w:p>
+        </w:tc>
+        <w:tc>
+          <w:tcPr>
+            <w:tcW w:w="1024" w:type="dxa"/>
+          </w:tcPr>
+          <w:p>
+            <w:r>
+              <w:t>Yes</w:t>
+            </w:r>
+          </w:p>
+        </w:tc>
+        <w:tc>
+          <w:tcPr>
+            <w:tcW w:w="3543" w:type="dxa"/>
+          </w:tcPr>
+          <w:p/>
+        </w:tc>
+      </w:tr>
+      <w:tr>
+        <w:tc>
+          <w:tcPr>
+            <w:tcW w:w="2116" w:type="dxa"/>
+          </w:tcPr>
+          <w:p>
+            <w:r>
+              <w:t>System should operate correctly under a multiplied expected load.</w:t>
+            </w:r>
+          </w:p>
+        </w:tc>
+        <w:tc>
+          <w:tcPr>
+            <w:tcW w:w="2951" w:type="dxa"/>
+          </w:tcPr>
+          <w:p>
+            <w:r>
+              <w:t>System should operate correctly under 4 times expected load.</w:t>
+            </w:r>
+          </w:p>
+        </w:tc>
+        <w:tc>
+          <w:tcPr>
+            <w:tcW w:w="1024" w:type="dxa"/>
           </w:tcPr>
           <w:p>
             <w:r>
@@ -1540,16 +1709,9 @@
         </w:tc>
         <w:tc>
           <w:tcPr>
-            <w:tcW w:w="2268" w:type="dxa"/>
-          </w:tcPr>
-          <w:p>
-            <w:r>
-              <w:t>This is because not webpages load within 15 milliseconds like the homepage or the rooms’ page as they need to fetch data when the website page is loaded.</w:t>
-            </w:r>
-            <w:r>
-              <w:t xml:space="preserve"> However other pages meet this requirement as they do not need data or only a little amount. This could be changed by either caching the rooms data in the servers or reducing the amount of data needed to show on the pages. This does not impact the solution a lot currently as it does not need to load a lot of data, but this can be an issue in the future when it will be loading hundreds or rooms and bookings to users.</w:t>
-            </w:r>
-          </w:p>
+            <w:tcW w:w="3543" w:type="dxa"/>
+          </w:tcPr>
+          <w:p/>
         </w:tc>
       </w:tr>
       <w:tr>
@@ -1559,7 +1721,7 @@
           </w:tcPr>
           <w:p>
             <w:r>
-              <w:t>The system must handle a specific number of requests without degradation.</w:t>
+              <w:t>Input delay should be at or under industry standards</w:t>
             </w:r>
           </w:p>
         </w:tc>
@@ -1569,29 +1731,35 @@
           </w:tcPr>
           <w:p>
             <w:r>
-              <w:t>On average the system should handle 30 requests per second without degradation.</w:t>
-            </w:r>
-          </w:p>
-        </w:tc>
-        <w:tc>
-          <w:tcPr>
-            <w:tcW w:w="2401" w:type="dxa"/>
-          </w:tcPr>
-          <w:p>
-            <w:r>
+              <w:t xml:space="preserve">Input delay should be at or under 200 milliseconds when interacting with functions that </w:t>
+            </w:r>
+            <w:r>
+              <w:lastRenderedPageBreak/>
+              <w:t>process more than 100kb of data.</w:t>
+            </w:r>
+          </w:p>
+          <w:p>
+            <w:r>
+              <w:t>Input delay should be at or under 100 milliseconds when interacting with functions that process more than 10kb of data.</w:t>
+            </w:r>
+          </w:p>
+        </w:tc>
+        <w:tc>
+          <w:tcPr>
+            <w:tcW w:w="1024" w:type="dxa"/>
+          </w:tcPr>
+          <w:p>
+            <w:r>
+              <w:lastRenderedPageBreak/>
               <w:t>Yes</w:t>
             </w:r>
           </w:p>
         </w:tc>
         <w:tc>
           <w:tcPr>
-            <w:tcW w:w="2268" w:type="dxa"/>
-          </w:tcPr>
-          <w:p>
-            <w:r>
-              <w:t>This is because the system can easily handle 30 requests per second and there is only a little amount of degradation which is in the expected amount.</w:t>
-            </w:r>
-          </w:p>
+            <w:tcW w:w="3543" w:type="dxa"/>
+          </w:tcPr>
+          <w:p/>
         </w:tc>
       </w:tr>
       <w:tr>
@@ -1601,7 +1769,7 @@
           </w:tcPr>
           <w:p>
             <w:r>
-              <w:t>CPU usage should not exceed a set amount</w:t>
+              <w:t>Payment should be processed quickly.</w:t>
             </w:r>
           </w:p>
         </w:tc>
@@ -1611,42 +1779,31 @@
           </w:tcPr>
           <w:p>
             <w:r>
-              <w:t>CPU usage should be under 20% on a S20 phone.</w:t>
-            </w:r>
-          </w:p>
-        </w:tc>
-        <w:tc>
-          <w:tcPr>
-            <w:tcW w:w="2401" w:type="dxa"/>
-          </w:tcPr>
-          <w:p>
-            <w:r>
-              <w:t>No</w:t>
-            </w:r>
-          </w:p>
-        </w:tc>
-        <w:tc>
-          <w:tcPr>
-            <w:tcW w:w="2268" w:type="dxa"/>
-          </w:tcPr>
-          <w:p>
-            <w:r>
-              <w:t>This is because the website load</w:t>
-            </w:r>
-            <w:r>
-              <w:t>s</w:t>
-            </w:r>
-            <w:r>
-              <w:t xml:space="preserve"> a lot of data inefficiently which makes the CPU</w:t>
-            </w:r>
-            <w:r>
-              <w:t xml:space="preserve"> usage skyrocket. This can be fixed by either compressing the data or loading the data in </w:t>
-            </w:r>
-            <w:r>
-              <w:lastRenderedPageBreak/>
-              <w:t>chucks to lower the CPU usage.</w:t>
-            </w:r>
-          </w:p>
+              <w:t>The payment</w:t>
+            </w:r>
+            <w:r>
+              <w:t xml:space="preserve"> processing speed</w:t>
+            </w:r>
+            <w:r>
+              <w:t xml:space="preserve"> should be at an industry standard.</w:t>
+            </w:r>
+          </w:p>
+        </w:tc>
+        <w:tc>
+          <w:tcPr>
+            <w:tcW w:w="1024" w:type="dxa"/>
+          </w:tcPr>
+          <w:p>
+            <w:r>
+              <w:t>Yes</w:t>
+            </w:r>
+          </w:p>
+        </w:tc>
+        <w:tc>
+          <w:tcPr>
+            <w:tcW w:w="3543" w:type="dxa"/>
+          </w:tcPr>
+          <w:p/>
         </w:tc>
       </w:tr>
       <w:tr>
@@ -1656,8 +1813,13 @@
           </w:tcPr>
           <w:p>
             <w:r>
-              <w:lastRenderedPageBreak/>
-              <w:t>System should operate correctly under a multiplied expected load.</w:t>
+              <w:t>Orders’</w:t>
+            </w:r>
+            <w:r>
+              <w:t xml:space="preserve"> status should be updated fast when changed</w:t>
+            </w:r>
+            <w:r>
+              <w:t>.</w:t>
             </w:r>
           </w:p>
         </w:tc>
@@ -1667,55 +1829,24 @@
           </w:tcPr>
           <w:p>
             <w:r>
-              <w:t>System should operate correctly under 4 times expected load.</w:t>
-            </w:r>
-          </w:p>
-        </w:tc>
-        <w:tc>
-          <w:tcPr>
-            <w:tcW w:w="2401" w:type="dxa"/>
-          </w:tcPr>
-          <w:p>
-            <w:r>
-              <w:t>No</w:t>
-            </w:r>
-          </w:p>
-        </w:tc>
-        <w:tc>
-          <w:tcPr>
-            <w:tcW w:w="2268" w:type="dxa"/>
-          </w:tcPr>
-          <w:p>
-            <w:r>
-              <w:t>This is because the data system is not designed to handle more load than expected. This means the system need to be changed to account for these factors. If it is not changed then it can impact the company negatively in the future with an actual commercial solution.</w:t>
-            </w:r>
-          </w:p>
-        </w:tc>
-      </w:tr>
-      <w:tr>
-        <w:tc>
-          <w:tcPr>
-            <w:tcW w:w="2116" w:type="dxa"/>
-          </w:tcPr>
-          <w:p>
-            <w:r>
-              <w:t>Input delay should be at or under industry standards</w:t>
-            </w:r>
-          </w:p>
-        </w:tc>
-        <w:tc>
-          <w:tcPr>
-            <w:tcW w:w="2951" w:type="dxa"/>
-          </w:tcPr>
-          <w:p>
-            <w:r>
-              <w:t>Input delay should be at or under 200 milliseconds.</w:t>
-            </w:r>
-          </w:p>
-        </w:tc>
-        <w:tc>
-          <w:tcPr>
-            <w:tcW w:w="2401" w:type="dxa"/>
+              <w:t>Orders’</w:t>
+            </w:r>
+            <w:r>
+              <w:t xml:space="preserve"> status being updated under 2 minutes after the status has been changed</w:t>
+            </w:r>
+            <w:r>
+              <w:t>, during 50 or more orders’ statuses are being changed.</w:t>
+            </w:r>
+          </w:p>
+          <w:p>
+            <w:r>
+              <w:tab/>
+            </w:r>
+          </w:p>
+        </w:tc>
+        <w:tc>
+          <w:tcPr>
+            <w:tcW w:w="1024" w:type="dxa"/>
           </w:tcPr>
           <w:p>
             <w:r>
@@ -1725,103 +1856,9 @@
         </w:tc>
         <w:tc>
           <w:tcPr>
-            <w:tcW w:w="2268" w:type="dxa"/>
-          </w:tcPr>
-          <w:p>
-            <w:r>
-              <w:t xml:space="preserve">This is because there </w:t>
-            </w:r>
-            <w:r>
-              <w:t>are</w:t>
-            </w:r>
-            <w:r>
-              <w:t xml:space="preserve"> no complex calculations happening that are connected to inputs of the client, which ensures there is little input delay. But it could become an issue in the future if the data fetched from the server is not handled properly.</w:t>
-            </w:r>
-          </w:p>
-        </w:tc>
-      </w:tr>
-      <w:tr>
-        <w:tc>
-          <w:tcPr>
-            <w:tcW w:w="2116" w:type="dxa"/>
-          </w:tcPr>
-          <w:p>
-            <w:r>
-              <w:t>Payment should be processed quickly.</w:t>
-            </w:r>
-          </w:p>
-        </w:tc>
-        <w:tc>
-          <w:tcPr>
-            <w:tcW w:w="2951" w:type="dxa"/>
-          </w:tcPr>
-          <w:p>
-            <w:r>
-              <w:t>The payment should be at an industry standard.</w:t>
-            </w:r>
-          </w:p>
-        </w:tc>
-        <w:tc>
-          <w:tcPr>
-            <w:tcW w:w="2401" w:type="dxa"/>
-          </w:tcPr>
-          <w:p>
-            <w:r>
-              <w:t>No</w:t>
-            </w:r>
-          </w:p>
-        </w:tc>
-        <w:tc>
-          <w:tcPr>
-            <w:tcW w:w="2268" w:type="dxa"/>
-          </w:tcPr>
-          <w:p>
-            <w:r>
-              <w:t>This is because no payment processors have been added yet, which means this will be need to be retested with a future improved solution that includes a payment processor.</w:t>
-            </w:r>
-          </w:p>
-        </w:tc>
-      </w:tr>
-      <w:tr>
-        <w:tc>
-          <w:tcPr>
-            <w:tcW w:w="2116" w:type="dxa"/>
-          </w:tcPr>
-          <w:p>
-            <w:r>
-              <w:t>Bookings’ status should be updated fast when changed</w:t>
-            </w:r>
-          </w:p>
-        </w:tc>
-        <w:tc>
-          <w:tcPr>
-            <w:tcW w:w="2951" w:type="dxa"/>
-          </w:tcPr>
-          <w:p>
-            <w:r>
-              <w:t xml:space="preserve">Bookings’ status being updated under 2 minutes after the status has been changed </w:t>
-            </w:r>
-          </w:p>
-        </w:tc>
-        <w:tc>
-          <w:tcPr>
-            <w:tcW w:w="2401" w:type="dxa"/>
-          </w:tcPr>
-          <w:p>
-            <w:r>
-              <w:t>Yes</w:t>
-            </w:r>
-          </w:p>
-        </w:tc>
-        <w:tc>
-          <w:tcPr>
-            <w:tcW w:w="2268" w:type="dxa"/>
-          </w:tcPr>
-          <w:p>
-            <w:r>
-              <w:t>This is because the changes are saved instantly to the server, which means when ever the user views the details of a booking it will be up to date.</w:t>
-            </w:r>
-          </w:p>
+            <w:tcW w:w="3543" w:type="dxa"/>
+          </w:tcPr>
+          <w:p/>
         </w:tc>
       </w:tr>
     </w:tbl>
@@ -1832,7 +1869,6 @@
       </w:pPr>
       <w:bookmarkStart w:id="0" w:name="_Toc220335514"/>
       <w:r>
-        <w:lastRenderedPageBreak/>
         <w:t>Security</w:t>
       </w:r>
       <w:bookmarkEnd w:id="0"/>
@@ -1846,8 +1882,8 @@
       <w:tblGrid>
         <w:gridCol w:w="2116"/>
         <w:gridCol w:w="2951"/>
-        <w:gridCol w:w="2401"/>
-        <w:gridCol w:w="2268"/>
+        <w:gridCol w:w="1091"/>
+        <w:gridCol w:w="3504"/>
       </w:tblGrid>
       <w:tr>
         <w:tc>
@@ -1892,7 +1928,7 @@
         </w:tc>
         <w:tc>
           <w:tcPr>
-            <w:tcW w:w="2401" w:type="dxa"/>
+            <w:tcW w:w="1091" w:type="dxa"/>
           </w:tcPr>
           <w:p>
             <w:pPr>
@@ -1912,7 +1948,7 @@
         </w:tc>
         <w:tc>
           <w:tcPr>
-            <w:tcW w:w="2268" w:type="dxa"/>
+            <w:tcW w:w="3504" w:type="dxa"/>
           </w:tcPr>
           <w:p>
             <w:pPr>
@@ -1954,7 +1990,126 @@
         </w:tc>
         <w:tc>
           <w:tcPr>
-            <w:tcW w:w="2401" w:type="dxa"/>
+            <w:tcW w:w="1091" w:type="dxa"/>
+          </w:tcPr>
+          <w:p>
+            <w:r>
+              <w:t>Not fully</w:t>
+            </w:r>
+          </w:p>
+        </w:tc>
+        <w:tc>
+          <w:tcPr>
+            <w:tcW w:w="3504" w:type="dxa"/>
+          </w:tcPr>
+          <w:p/>
+        </w:tc>
+      </w:tr>
+      <w:tr>
+        <w:tc>
+          <w:tcPr>
+            <w:tcW w:w="2116" w:type="dxa"/>
+          </w:tcPr>
+          <w:p>
+            <w:r>
+              <w:t>Account password should be considered complex by industry standards</w:t>
+            </w:r>
+          </w:p>
+        </w:tc>
+        <w:tc>
+          <w:tcPr>
+            <w:tcW w:w="2951" w:type="dxa"/>
+          </w:tcPr>
+          <w:p>
+            <w:r>
+              <w:t>Account password should be at least 8 character long, contain letters, numbers and special characters to be consider complex.</w:t>
+            </w:r>
+          </w:p>
+        </w:tc>
+        <w:tc>
+          <w:tcPr>
+            <w:tcW w:w="1091" w:type="dxa"/>
+          </w:tcPr>
+          <w:p>
+            <w:r>
+              <w:t>Yes</w:t>
+            </w:r>
+          </w:p>
+        </w:tc>
+        <w:tc>
+          <w:tcPr>
+            <w:tcW w:w="3504" w:type="dxa"/>
+          </w:tcPr>
+          <w:p/>
+        </w:tc>
+      </w:tr>
+      <w:tr>
+        <w:tc>
+          <w:tcPr>
+            <w:tcW w:w="2116" w:type="dxa"/>
+          </w:tcPr>
+          <w:p>
+            <w:r>
+              <w:t>Data should be encrypted during transit.</w:t>
+            </w:r>
+          </w:p>
+        </w:tc>
+        <w:tc>
+          <w:tcPr>
+            <w:tcW w:w="2951" w:type="dxa"/>
+          </w:tcPr>
+          <w:p>
+            <w:r>
+              <w:t>Website should enforce HTTPS on data when it is in transits.</w:t>
+            </w:r>
+          </w:p>
+          <w:p>
+            <w:r>
+              <w:t>Data being transited should not contain sensitive information that is not encrypted before being transited.</w:t>
+            </w:r>
+          </w:p>
+        </w:tc>
+        <w:tc>
+          <w:tcPr>
+            <w:tcW w:w="1091" w:type="dxa"/>
+          </w:tcPr>
+          <w:p>
+            <w:r>
+              <w:t>Not fully</w:t>
+            </w:r>
+          </w:p>
+        </w:tc>
+        <w:tc>
+          <w:tcPr>
+            <w:tcW w:w="3504" w:type="dxa"/>
+          </w:tcPr>
+          <w:p/>
+        </w:tc>
+      </w:tr>
+      <w:tr>
+        <w:tc>
+          <w:tcPr>
+            <w:tcW w:w="2116" w:type="dxa"/>
+          </w:tcPr>
+          <w:p>
+            <w:r>
+              <w:t>There should be explicit user consent for cookies</w:t>
+            </w:r>
+          </w:p>
+        </w:tc>
+        <w:tc>
+          <w:tcPr>
+            <w:tcW w:w="2951" w:type="dxa"/>
+          </w:tcPr>
+          <w:p>
+            <w:r>
+              <w:t>Cookies should be visible on any page of the website with a clear way to accept or deny the cookies.</w:t>
+            </w:r>
+          </w:p>
+        </w:tc>
+        <w:tc>
+          <w:tcPr>
+            <w:tcW w:w="1091" w:type="dxa"/>
           </w:tcPr>
           <w:p>
             <w:r>
@@ -1964,28 +2119,9 @@
         </w:tc>
         <w:tc>
           <w:tcPr>
-            <w:tcW w:w="2268" w:type="dxa"/>
-          </w:tcPr>
-          <w:p>
-            <w:r>
-              <w:t xml:space="preserve">This is because a different encryption method is being used that is not known. This can result in malicious users able to have access to other </w:t>
-            </w:r>
-            <w:r>
-              <w:t>users’</w:t>
-            </w:r>
-            <w:r>
-              <w:t xml:space="preserve"> data, which means the client will be fined if this ever happens in the future. To ensure this does not happen the encryption technique will be need to be check</w:t>
-            </w:r>
-            <w:r>
-              <w:t>ed</w:t>
-            </w:r>
-            <w:r>
-              <w:t xml:space="preserve"> and changed accordingly</w:t>
-            </w:r>
-            <w:r>
-              <w:t>.</w:t>
-            </w:r>
-          </w:p>
+            <w:tcW w:w="3504" w:type="dxa"/>
+          </w:tcPr>
+          <w:p/>
         </w:tc>
       </w:tr>
       <w:tr>
@@ -1995,7 +2131,7 @@
           </w:tcPr>
           <w:p>
             <w:r>
-              <w:t>Account password should be considered complex by industry standards</w:t>
+              <w:t>Account details of the user should be censored.</w:t>
             </w:r>
           </w:p>
         </w:tc>
@@ -2005,13 +2141,57 @@
           </w:tcPr>
           <w:p>
             <w:r>
-              <w:t>Account password should be at least 8 character long, contain letters, numbers and special characters to be consider complex.</w:t>
-            </w:r>
-          </w:p>
-        </w:tc>
-        <w:tc>
-          <w:tcPr>
-            <w:tcW w:w="2401" w:type="dxa"/>
+              <w:t>Important details like passwords and emails will be replaced with asterisks or dots, these will be the same amount regardless the number of characters.</w:t>
+            </w:r>
+          </w:p>
+        </w:tc>
+        <w:tc>
+          <w:tcPr>
+            <w:tcW w:w="1091" w:type="dxa"/>
+          </w:tcPr>
+          <w:p>
+            <w:r>
+              <w:t>N/A</w:t>
+            </w:r>
+          </w:p>
+        </w:tc>
+        <w:tc>
+          <w:tcPr>
+            <w:tcW w:w="3504" w:type="dxa"/>
+          </w:tcPr>
+          <w:p/>
+        </w:tc>
+      </w:tr>
+      <w:tr>
+        <w:tc>
+          <w:tcPr>
+            <w:tcW w:w="2116" w:type="dxa"/>
+          </w:tcPr>
+          <w:p>
+            <w:r>
+              <w:lastRenderedPageBreak/>
+              <w:t>Payment details should not be shown on the screen by default.</w:t>
+            </w:r>
+          </w:p>
+        </w:tc>
+        <w:tc>
+          <w:tcPr>
+            <w:tcW w:w="2951" w:type="dxa"/>
+          </w:tcPr>
+          <w:p>
+            <w:r>
+              <w:t xml:space="preserve">Card numbers will be replaced with asterisks or dots, when they are being typed in or just being displayed. </w:t>
+            </w:r>
+          </w:p>
+          <w:p>
+            <w:r>
+              <w:t>Card holder’s full name should be abbreviated to only show the surname on screen.</w:t>
+            </w:r>
+          </w:p>
+        </w:tc>
+        <w:tc>
+          <w:tcPr>
+            <w:tcW w:w="1091" w:type="dxa"/>
           </w:tcPr>
           <w:p>
             <w:r>
@@ -2021,13 +2201,9 @@
         </w:tc>
         <w:tc>
           <w:tcPr>
-            <w:tcW w:w="2268" w:type="dxa"/>
-          </w:tcPr>
-          <w:p>
-            <w:r>
-              <w:t>This because all passwords are hashed in the database, which means attackers will have a harder time at getting access to a password of a user.</w:t>
-            </w:r>
-          </w:p>
+            <w:tcW w:w="3504" w:type="dxa"/>
+          </w:tcPr>
+          <w:p/>
         </w:tc>
       </w:tr>
       <w:tr>
@@ -2037,7 +2213,7 @@
           </w:tcPr>
           <w:p>
             <w:r>
-              <w:t>Data should be encrypted during transit.</w:t>
+              <w:t>Users given specific roles</w:t>
             </w:r>
           </w:p>
         </w:tc>
@@ -2047,13 +2223,157 @@
           </w:tcPr>
           <w:p>
             <w:r>
-              <w:t>Website should enforce HTTPS on data when it is in transits.</w:t>
-            </w:r>
-          </w:p>
-        </w:tc>
-        <w:tc>
-          <w:tcPr>
-            <w:tcW w:w="2401" w:type="dxa"/>
+              <w:t>Users are only able to view pages that they are allowed based on their roles.</w:t>
+            </w:r>
+          </w:p>
+        </w:tc>
+        <w:tc>
+          <w:tcPr>
+            <w:tcW w:w="1091" w:type="dxa"/>
+          </w:tcPr>
+          <w:p>
+            <w:r>
+              <w:t>Yes</w:t>
+            </w:r>
+          </w:p>
+        </w:tc>
+        <w:tc>
+          <w:tcPr>
+            <w:tcW w:w="3504" w:type="dxa"/>
+          </w:tcPr>
+          <w:p/>
+        </w:tc>
+      </w:tr>
+    </w:tbl>
+    <w:p/>
+    <w:p>
+      <w:pPr>
+        <w:pStyle w:val="Heading2"/>
+      </w:pPr>
+      <w:bookmarkStart w:id="1" w:name="_Toc223976666"/>
+      <w:r>
+        <w:t>Capacity</w:t>
+      </w:r>
+      <w:bookmarkEnd w:id="1"/>
+    </w:p>
+    <w:tbl>
+      <w:tblPr>
+        <w:tblStyle w:val="TableGrid"/>
+        <w:tblW w:w="0" w:type="auto"/>
+        <w:tblLook w:val="04A0" w:firstRow="1" w:lastRow="0" w:firstColumn="1" w:lastColumn="0" w:noHBand="0" w:noVBand="1"/>
+      </w:tblPr>
+      <w:tblGrid>
+        <w:gridCol w:w="2116"/>
+        <w:gridCol w:w="2951"/>
+        <w:gridCol w:w="1024"/>
+        <w:gridCol w:w="3543"/>
+      </w:tblGrid>
+      <w:tr>
+        <w:tc>
+          <w:tcPr>
+            <w:tcW w:w="2116" w:type="dxa"/>
+          </w:tcPr>
+          <w:p>
+            <w:pPr>
+              <w:rPr>
+                <w:b/>
+                <w:bCs/>
+              </w:rPr>
+            </w:pPr>
+            <w:r>
+              <w:rPr>
+                <w:b/>
+                <w:bCs/>
+              </w:rPr>
+              <w:t>Requirement</w:t>
+            </w:r>
+          </w:p>
+        </w:tc>
+        <w:tc>
+          <w:tcPr>
+            <w:tcW w:w="2951" w:type="dxa"/>
+          </w:tcPr>
+          <w:p>
+            <w:pPr>
+              <w:rPr>
+                <w:b/>
+                <w:bCs/>
+              </w:rPr>
+            </w:pPr>
+            <w:r>
+              <w:rPr>
+                <w:b/>
+                <w:bCs/>
+              </w:rPr>
+              <w:t>KPI</w:t>
+            </w:r>
+          </w:p>
+        </w:tc>
+        <w:tc>
+          <w:tcPr>
+            <w:tcW w:w="1024" w:type="dxa"/>
+          </w:tcPr>
+          <w:p>
+            <w:pPr>
+              <w:rPr>
+                <w:b/>
+                <w:bCs/>
+              </w:rPr>
+            </w:pPr>
+            <w:r>
+              <w:rPr>
+                <w:b/>
+                <w:bCs/>
+              </w:rPr>
+              <w:t>Met</w:t>
+            </w:r>
+          </w:p>
+        </w:tc>
+        <w:tc>
+          <w:tcPr>
+            <w:tcW w:w="3543" w:type="dxa"/>
+          </w:tcPr>
+          <w:p>
+            <w:pPr>
+              <w:rPr>
+                <w:b/>
+                <w:bCs/>
+              </w:rPr>
+            </w:pPr>
+            <w:r>
+              <w:rPr>
+                <w:b/>
+                <w:bCs/>
+              </w:rPr>
+              <w:t>Explanation</w:t>
+            </w:r>
+          </w:p>
+        </w:tc>
+      </w:tr>
+      <w:tr>
+        <w:tc>
+          <w:tcPr>
+            <w:tcW w:w="2116" w:type="dxa"/>
+          </w:tcPr>
+          <w:p>
+            <w:r>
+              <w:t>The website should be able to handle a max number of users without the system crashing</w:t>
+            </w:r>
+          </w:p>
+        </w:tc>
+        <w:tc>
+          <w:tcPr>
+            <w:tcW w:w="2951" w:type="dxa"/>
+          </w:tcPr>
+          <w:p>
+            <w:r>
+              <w:t>The website should be able to handle max of 1000 users at the same time without the system crashing.</w:t>
+            </w:r>
+          </w:p>
+        </w:tc>
+        <w:tc>
+          <w:tcPr>
+            <w:tcW w:w="1024" w:type="dxa"/>
           </w:tcPr>
           <w:p>
             <w:r>
@@ -2063,13 +2383,9 @@
         </w:tc>
         <w:tc>
           <w:tcPr>
-            <w:tcW w:w="2268" w:type="dxa"/>
-          </w:tcPr>
-          <w:p>
-            <w:r>
-              <w:t>This is because the solution has been configured to use https when running. This can be bad in the future as this will expose potentially sensitive data to malicious users.</w:t>
-            </w:r>
-          </w:p>
+            <w:tcW w:w="3543" w:type="dxa"/>
+          </w:tcPr>
+          <w:p/>
         </w:tc>
       </w:tr>
       <w:tr>
@@ -2079,7 +2395,7 @@
           </w:tcPr>
           <w:p>
             <w:r>
-              <w:t>There should be explicit user consent for cookies</w:t>
+              <w:t>The website should be able to handle many transactions per second under peak load</w:t>
             </w:r>
           </w:p>
         </w:tc>
@@ -2089,13 +2405,13 @@
           </w:tcPr>
           <w:p>
             <w:r>
-              <w:t>Cookies should be visible on any page of the website with a clear way to accept or deny the cookies.</w:t>
-            </w:r>
-          </w:p>
-        </w:tc>
-        <w:tc>
-          <w:tcPr>
-            <w:tcW w:w="2401" w:type="dxa"/>
+              <w:t>500 transactions per second should be sustained with less than or equal to 5% error rate.</w:t>
+            </w:r>
+          </w:p>
+        </w:tc>
+        <w:tc>
+          <w:tcPr>
+            <w:tcW w:w="1024" w:type="dxa"/>
           </w:tcPr>
           <w:p>
             <w:r>
@@ -2105,19 +2421,9 @@
         </w:tc>
         <w:tc>
           <w:tcPr>
-            <w:tcW w:w="2268" w:type="dxa"/>
-          </w:tcPr>
-          <w:p>
-            <w:r>
-              <w:t xml:space="preserve">This is because a cookies section has not been created in webpages and the logic for the cookies has not been created. Which can lead to fines for the company, to ensure this does not happen in a future solution it will </w:t>
-            </w:r>
-            <w:r>
-              <w:t>include</w:t>
-            </w:r>
-            <w:r>
-              <w:t xml:space="preserve"> a working and compliant cookies section.</w:t>
-            </w:r>
-          </w:p>
+            <w:tcW w:w="3543" w:type="dxa"/>
+          </w:tcPr>
+          <w:p/>
         </w:tc>
       </w:tr>
       <w:tr>
@@ -2127,8 +2433,313 @@
           </w:tcPr>
           <w:p>
             <w:r>
+              <w:t>The website should be able to store data of many customers without overwriting previous data of other customers.</w:t>
+            </w:r>
+          </w:p>
+        </w:tc>
+        <w:tc>
+          <w:tcPr>
+            <w:tcW w:w="2951" w:type="dxa"/>
+          </w:tcPr>
+          <w:p>
+            <w:r>
+              <w:t>The website should be able to store up to 10TB of data</w:t>
+            </w:r>
+            <w:r>
+              <w:t xml:space="preserve"> for 10,000 customer accounts.</w:t>
+            </w:r>
+          </w:p>
+          <w:p/>
+        </w:tc>
+        <w:tc>
+          <w:tcPr>
+            <w:tcW w:w="1024" w:type="dxa"/>
+          </w:tcPr>
+          <w:p>
+            <w:r>
+              <w:t>No</w:t>
+            </w:r>
+          </w:p>
+        </w:tc>
+        <w:tc>
+          <w:tcPr>
+            <w:tcW w:w="3543" w:type="dxa"/>
+          </w:tcPr>
+          <w:p/>
+        </w:tc>
+      </w:tr>
+    </w:tbl>
+    <w:p/>
+    <w:p>
+      <w:pPr>
+        <w:pStyle w:val="Heading2"/>
+      </w:pPr>
+      <w:bookmarkStart w:id="2" w:name="_Toc223976667"/>
+      <w:r>
+        <w:t>Scalability</w:t>
+      </w:r>
+      <w:bookmarkEnd w:id="2"/>
+    </w:p>
+    <w:tbl>
+      <w:tblPr>
+        <w:tblStyle w:val="TableGrid"/>
+        <w:tblW w:w="0" w:type="auto"/>
+        <w:tblLook w:val="04A0" w:firstRow="1" w:lastRow="0" w:firstColumn="1" w:lastColumn="0" w:noHBand="0" w:noVBand="1"/>
+      </w:tblPr>
+      <w:tblGrid>
+        <w:gridCol w:w="2116"/>
+        <w:gridCol w:w="2951"/>
+        <w:gridCol w:w="1024"/>
+        <w:gridCol w:w="3543"/>
+      </w:tblGrid>
+      <w:tr>
+        <w:tc>
+          <w:tcPr>
+            <w:tcW w:w="2116" w:type="dxa"/>
+          </w:tcPr>
+          <w:p>
+            <w:pPr>
+              <w:rPr>
+                <w:b/>
+                <w:bCs/>
+              </w:rPr>
+            </w:pPr>
+            <w:r>
+              <w:rPr>
+                <w:b/>
+                <w:bCs/>
+              </w:rPr>
+              <w:t>Requirement</w:t>
+            </w:r>
+          </w:p>
+        </w:tc>
+        <w:tc>
+          <w:tcPr>
+            <w:tcW w:w="2951" w:type="dxa"/>
+          </w:tcPr>
+          <w:p>
+            <w:pPr>
+              <w:rPr>
+                <w:b/>
+                <w:bCs/>
+              </w:rPr>
+            </w:pPr>
+            <w:r>
+              <w:rPr>
+                <w:b/>
+                <w:bCs/>
+              </w:rPr>
+              <w:t>KPI</w:t>
+            </w:r>
+          </w:p>
+        </w:tc>
+        <w:tc>
+          <w:tcPr>
+            <w:tcW w:w="1024" w:type="dxa"/>
+          </w:tcPr>
+          <w:p>
+            <w:pPr>
+              <w:rPr>
+                <w:b/>
+                <w:bCs/>
+              </w:rPr>
+            </w:pPr>
+            <w:r>
+              <w:rPr>
+                <w:b/>
+                <w:bCs/>
+              </w:rPr>
+              <w:t>Met</w:t>
+            </w:r>
+          </w:p>
+        </w:tc>
+        <w:tc>
+          <w:tcPr>
+            <w:tcW w:w="3543" w:type="dxa"/>
+          </w:tcPr>
+          <w:p>
+            <w:pPr>
+              <w:rPr>
+                <w:b/>
+                <w:bCs/>
+              </w:rPr>
+            </w:pPr>
+            <w:r>
+              <w:rPr>
+                <w:b/>
+                <w:bCs/>
+              </w:rPr>
+              <w:t>Explanation</w:t>
+            </w:r>
+          </w:p>
+        </w:tc>
+      </w:tr>
+      <w:tr>
+        <w:tc>
+          <w:tcPr>
+            <w:tcW w:w="2116" w:type="dxa"/>
+          </w:tcPr>
+          <w:p>
+            <w:r>
+              <w:t xml:space="preserve">New functions should be added at an industry standard pace to the application </w:t>
+            </w:r>
+          </w:p>
+        </w:tc>
+        <w:tc>
+          <w:tcPr>
+            <w:tcW w:w="2951" w:type="dxa"/>
+          </w:tcPr>
+          <w:p>
+            <w:r>
+              <w:t>On average, every new major function should be added within 5 to 10 days.</w:t>
+            </w:r>
+          </w:p>
+          <w:p>
+            <w:r>
+              <w:t>On average, every new minor function should be added within 1 to 3 days.</w:t>
+            </w:r>
+          </w:p>
+        </w:tc>
+        <w:tc>
+          <w:tcPr>
+            <w:tcW w:w="1024" w:type="dxa"/>
+          </w:tcPr>
+          <w:p>
+            <w:r>
+              <w:t>Yes</w:t>
+            </w:r>
+          </w:p>
+        </w:tc>
+        <w:tc>
+          <w:tcPr>
+            <w:tcW w:w="3543" w:type="dxa"/>
+          </w:tcPr>
+          <w:p/>
+        </w:tc>
+      </w:tr>
+      <w:tr>
+        <w:tc>
+          <w:tcPr>
+            <w:tcW w:w="2116" w:type="dxa"/>
+          </w:tcPr>
+          <w:p>
+            <w:r>
+              <w:t>Traffic should be dispersed across different servers.</w:t>
+            </w:r>
+          </w:p>
+        </w:tc>
+        <w:tc>
+          <w:tcPr>
+            <w:tcW w:w="2951" w:type="dxa"/>
+          </w:tcPr>
+          <w:p>
+            <w:r>
+              <w:t>On average traffic should be dispersed evenly across all the different servers.</w:t>
+            </w:r>
+          </w:p>
+        </w:tc>
+        <w:tc>
+          <w:tcPr>
+            <w:tcW w:w="1024" w:type="dxa"/>
+          </w:tcPr>
+          <w:p>
+            <w:r>
+              <w:t>No</w:t>
+            </w:r>
+          </w:p>
+        </w:tc>
+        <w:tc>
+          <w:tcPr>
+            <w:tcW w:w="3543" w:type="dxa"/>
+          </w:tcPr>
+          <w:p/>
+        </w:tc>
+      </w:tr>
+      <w:tr>
+        <w:tc>
+          <w:tcPr>
+            <w:tcW w:w="2116" w:type="dxa"/>
+          </w:tcPr>
+          <w:p>
+            <w:r>
+              <w:t>The code should be easily maintained and understandable by others.</w:t>
+            </w:r>
+          </w:p>
+        </w:tc>
+        <w:tc>
+          <w:tcPr>
+            <w:tcW w:w="2951" w:type="dxa"/>
+          </w:tcPr>
+          <w:p>
+            <w:r>
+              <w:t xml:space="preserve">A third party should be able to understand the coding conventions and logic being used in the solution and edit </w:t>
+            </w:r>
+            <w:r>
               <w:lastRenderedPageBreak/>
-              <w:t>Account details of the user should be censored.</w:t>
+              <w:t>the code easily after a week of reviewing.</w:t>
+            </w:r>
+          </w:p>
+        </w:tc>
+        <w:tc>
+          <w:tcPr>
+            <w:tcW w:w="1024" w:type="dxa"/>
+          </w:tcPr>
+          <w:p>
+            <w:r>
+              <w:lastRenderedPageBreak/>
+              <w:t>Yes</w:t>
+            </w:r>
+          </w:p>
+        </w:tc>
+        <w:tc>
+          <w:tcPr>
+            <w:tcW w:w="3543" w:type="dxa"/>
+          </w:tcPr>
+          <w:p/>
+        </w:tc>
+      </w:tr>
+    </w:tbl>
+    <w:p/>
+    <w:p>
+      <w:pPr>
+        <w:pStyle w:val="Heading2"/>
+      </w:pPr>
+      <w:bookmarkStart w:id="3" w:name="_Toc223976668"/>
+      <w:r>
+        <w:t>Usability and Accessibility</w:t>
+      </w:r>
+      <w:bookmarkEnd w:id="3"/>
+    </w:p>
+    <w:tbl>
+      <w:tblPr>
+        <w:tblStyle w:val="TableGrid"/>
+        <w:tblW w:w="0" w:type="auto"/>
+        <w:tblLook w:val="04A0" w:firstRow="1" w:lastRow="0" w:firstColumn="1" w:lastColumn="0" w:noHBand="0" w:noVBand="1"/>
+      </w:tblPr>
+      <w:tblGrid>
+        <w:gridCol w:w="2116"/>
+        <w:gridCol w:w="2951"/>
+        <w:gridCol w:w="1024"/>
+        <w:gridCol w:w="3543"/>
+      </w:tblGrid>
+      <w:tr>
+        <w:tc>
+          <w:tcPr>
+            <w:tcW w:w="2116" w:type="dxa"/>
+          </w:tcPr>
+          <w:p>
+            <w:pPr>
+              <w:rPr>
+                <w:b/>
+                <w:bCs/>
+              </w:rPr>
+            </w:pPr>
+            <w:r>
+              <w:rPr>
+                <w:b/>
+                <w:bCs/>
+              </w:rPr>
+              <w:t>Requirement</w:t>
             </w:r>
           </w:p>
         </w:tc>
@@ -2137,14 +2748,86 @@
             <w:tcW w:w="2951" w:type="dxa"/>
           </w:tcPr>
           <w:p>
-            <w:r>
-              <w:t>Important details like passwords and emails will be replaced with asterisks or dots, these will be the same amount regardless the number of characters.</w:t>
-            </w:r>
-          </w:p>
-        </w:tc>
-        <w:tc>
-          <w:tcPr>
-            <w:tcW w:w="2401" w:type="dxa"/>
+            <w:pPr>
+              <w:rPr>
+                <w:b/>
+                <w:bCs/>
+              </w:rPr>
+            </w:pPr>
+            <w:r>
+              <w:rPr>
+                <w:b/>
+                <w:bCs/>
+              </w:rPr>
+              <w:t>KPI</w:t>
+            </w:r>
+          </w:p>
+        </w:tc>
+        <w:tc>
+          <w:tcPr>
+            <w:tcW w:w="1024" w:type="dxa"/>
+          </w:tcPr>
+          <w:p>
+            <w:pPr>
+              <w:rPr>
+                <w:b/>
+                <w:bCs/>
+              </w:rPr>
+            </w:pPr>
+            <w:r>
+              <w:rPr>
+                <w:b/>
+                <w:bCs/>
+              </w:rPr>
+              <w:t>Met</w:t>
+            </w:r>
+          </w:p>
+        </w:tc>
+        <w:tc>
+          <w:tcPr>
+            <w:tcW w:w="3543" w:type="dxa"/>
+          </w:tcPr>
+          <w:p>
+            <w:pPr>
+              <w:rPr>
+                <w:b/>
+                <w:bCs/>
+              </w:rPr>
+            </w:pPr>
+            <w:r>
+              <w:rPr>
+                <w:b/>
+                <w:bCs/>
+              </w:rPr>
+              <w:t>Explanation</w:t>
+            </w:r>
+          </w:p>
+        </w:tc>
+      </w:tr>
+      <w:tr>
+        <w:tc>
+          <w:tcPr>
+            <w:tcW w:w="2116" w:type="dxa"/>
+          </w:tcPr>
+          <w:p>
+            <w:r>
+              <w:t>Webpage should adapt to different device sizes</w:t>
+            </w:r>
+          </w:p>
+        </w:tc>
+        <w:tc>
+          <w:tcPr>
+            <w:tcW w:w="2951" w:type="dxa"/>
+          </w:tcPr>
+          <w:p>
+            <w:r>
+              <w:t>Webpage elements all are visible at different device sizes.</w:t>
+            </w:r>
+          </w:p>
+        </w:tc>
+        <w:tc>
+          <w:tcPr>
+            <w:tcW w:w="1024" w:type="dxa"/>
           </w:tcPr>
           <w:p>
             <w:r>
@@ -2154,13 +2837,9 @@
         </w:tc>
         <w:tc>
           <w:tcPr>
-            <w:tcW w:w="2268" w:type="dxa"/>
-          </w:tcPr>
-          <w:p>
-            <w:r>
-              <w:t>This is because users can view their details fully and their information has not been censored. This can be an issue in the future, if bad actors can view what users’ details are from profile page.</w:t>
-            </w:r>
-          </w:p>
+            <w:tcW w:w="3543" w:type="dxa"/>
+          </w:tcPr>
+          <w:p/>
         </w:tc>
       </w:tr>
       <w:tr>
@@ -2170,7 +2849,7 @@
           </w:tcPr>
           <w:p>
             <w:r>
-              <w:t>Payment details should not be shown on the screen by default.</w:t>
+              <w:t>Website should have intuitive and consistent navigation</w:t>
             </w:r>
           </w:p>
         </w:tc>
@@ -2180,46 +2859,25 @@
           </w:tcPr>
           <w:p>
             <w:r>
-              <w:t xml:space="preserve">Card numbers will be replaced with asterisks or dots, when they are being typed in or just being displayed. </w:t>
-            </w:r>
-          </w:p>
-          <w:p>
-            <w:r>
-              <w:t>Card holder’s full name should be abbreviated to only show the surname on screen.</w:t>
-            </w:r>
-          </w:p>
-        </w:tc>
-        <w:tc>
-          <w:tcPr>
-            <w:tcW w:w="2401" w:type="dxa"/>
-          </w:tcPr>
-          <w:p>
-            <w:r>
-              <w:t>No</w:t>
-            </w:r>
-          </w:p>
-        </w:tc>
-        <w:tc>
-          <w:tcPr>
-            <w:tcW w:w="2268" w:type="dxa"/>
-          </w:tcPr>
-          <w:p>
-            <w:r>
-              <w:t>This is because a payment process has not been added and therefore no details are being taken from the users. But this will change in the future when</w:t>
-            </w:r>
-            <w:r>
-              <w:t xml:space="preserve"> a</w:t>
-            </w:r>
-            <w:r>
-              <w:t xml:space="preserve"> payment process </w:t>
-            </w:r>
-            <w:r>
-              <w:t>is</w:t>
-            </w:r>
-            <w:r>
-              <w:t xml:space="preserve"> added to the solution and therefore the future solution will need to meet this requirement.</w:t>
-            </w:r>
-          </w:p>
+              <w:t>Any page should be able to be reached within 3 clicks from the homepage.</w:t>
+            </w:r>
+          </w:p>
+        </w:tc>
+        <w:tc>
+          <w:tcPr>
+            <w:tcW w:w="1024" w:type="dxa"/>
+          </w:tcPr>
+          <w:p>
+            <w:r>
+              <w:t>Yes</w:t>
+            </w:r>
+          </w:p>
+        </w:tc>
+        <w:tc>
+          <w:tcPr>
+            <w:tcW w:w="3543" w:type="dxa"/>
+          </w:tcPr>
+          <w:p/>
         </w:tc>
       </w:tr>
       <w:tr>
@@ -2229,7 +2887,7 @@
           </w:tcPr>
           <w:p>
             <w:r>
-              <w:t xml:space="preserve">Users given specific roles </w:t>
+              <w:t>Interactive elements should provide immediate visual feedback when interacted with</w:t>
             </w:r>
           </w:p>
         </w:tc>
@@ -2239,13 +2897,89 @@
           </w:tcPr>
           <w:p>
             <w:r>
-              <w:t>Users are only able to view pages that they are allowed based on their roles.</w:t>
-            </w:r>
-          </w:p>
-        </w:tc>
-        <w:tc>
-          <w:tcPr>
-            <w:tcW w:w="2401" w:type="dxa"/>
+              <w:t>All interactive components should change their state (colour, animation, size and etc) within 1 second of user interaction.</w:t>
+            </w:r>
+          </w:p>
+        </w:tc>
+        <w:tc>
+          <w:tcPr>
+            <w:tcW w:w="1024" w:type="dxa"/>
+          </w:tcPr>
+          <w:p>
+            <w:r>
+              <w:t>Yes</w:t>
+            </w:r>
+          </w:p>
+        </w:tc>
+        <w:tc>
+          <w:tcPr>
+            <w:tcW w:w="3543" w:type="dxa"/>
+          </w:tcPr>
+          <w:p/>
+        </w:tc>
+      </w:tr>
+      <w:tr>
+        <w:tc>
+          <w:tcPr>
+            <w:tcW w:w="2116" w:type="dxa"/>
+          </w:tcPr>
+          <w:p>
+            <w:r>
+              <w:t>Should have maintain consistent visual design and content tone throughout all pages</w:t>
+            </w:r>
+          </w:p>
+        </w:tc>
+        <w:tc>
+          <w:tcPr>
+            <w:tcW w:w="2951" w:type="dxa"/>
+          </w:tcPr>
+          <w:p>
+            <w:r>
+              <w:t>All pages should fully adhere to the design document of the website.</w:t>
+            </w:r>
+          </w:p>
+        </w:tc>
+        <w:tc>
+          <w:tcPr>
+            <w:tcW w:w="1024" w:type="dxa"/>
+          </w:tcPr>
+          <w:p>
+            <w:r>
+              <w:t>Yes</w:t>
+            </w:r>
+          </w:p>
+        </w:tc>
+        <w:tc>
+          <w:tcPr>
+            <w:tcW w:w="3543" w:type="dxa"/>
+          </w:tcPr>
+          <w:p/>
+        </w:tc>
+      </w:tr>
+      <w:tr>
+        <w:tc>
+          <w:tcPr>
+            <w:tcW w:w="2116" w:type="dxa"/>
+          </w:tcPr>
+          <w:p>
+            <w:r>
+              <w:t>The solution must show errors in an informative and understandable way.</w:t>
+            </w:r>
+          </w:p>
+        </w:tc>
+        <w:tc>
+          <w:tcPr>
+            <w:tcW w:w="2951" w:type="dxa"/>
+          </w:tcPr>
+          <w:p>
+            <w:r>
+              <w:t>Users should not have no complaints of them being confused or frustrated with errors.</w:t>
+            </w:r>
+          </w:p>
+        </w:tc>
+        <w:tc>
+          <w:tcPr>
+            <w:tcW w:w="1024" w:type="dxa"/>
           </w:tcPr>
           <w:p>
             <w:r>
@@ -2255,22 +2989,9 @@
         </w:tc>
         <w:tc>
           <w:tcPr>
-            <w:tcW w:w="2268" w:type="dxa"/>
-          </w:tcPr>
-          <w:p>
-            <w:r>
-              <w:t xml:space="preserve">This is because new users that make their own accounts are not assigned a role which means they can view pages that have not been configured </w:t>
-            </w:r>
-            <w:r>
-              <w:t>properly</w:t>
-            </w:r>
-            <w:r>
-              <w:t>.</w:t>
-            </w:r>
-            <w:r>
-              <w:t xml:space="preserve"> This will be a significant issue in the future as bad actors can easily access pages that they are not supposed to access.</w:t>
-            </w:r>
-          </w:p>
+            <w:tcW w:w="3543" w:type="dxa"/>
+          </w:tcPr>
+          <w:p/>
         </w:tc>
       </w:tr>
     </w:tbl>
@@ -2288,84 +3009,9 @@
         <w:pStyle w:val="ListParagraph"/>
         <w:numPr>
           <w:ilvl w:val="0"/>
-          <w:numId w:val="8"/>
+          <w:numId w:val="9"/>
         </w:numPr>
       </w:pPr>
-      <w:r>
-        <w:t xml:space="preserve">Adding a payment process to the solution, so that customers can pay for their bookings online rather than in-person. This will improve the user experience and give them a competitive advantage of competitors who do not have a payment processor setup on their websites. </w:t>
-      </w:r>
-      <w:r>
-        <w:t>Furthermore,</w:t>
-      </w:r>
-      <w:r>
-        <w:t xml:space="preserve"> this is industry standard to have and if customers do not have access to this in the solutions than they will </w:t>
-      </w:r>
-      <w:r>
-        <w:t>trust the company less.</w:t>
-      </w:r>
-    </w:p>
-    <w:p>
-      <w:pPr>
-        <w:pStyle w:val="ListParagraph"/>
-        <w:numPr>
-          <w:ilvl w:val="0"/>
-          <w:numId w:val="8"/>
-        </w:numPr>
-      </w:pPr>
-      <w:r>
-        <w:lastRenderedPageBreak/>
-        <w:t xml:space="preserve">Improving the layout of the website, since the current layout is aesthetically pleasing for users and does not meet industry standard, which means it does not look professional and as a result make corporate customers less likely to use </w:t>
-      </w:r>
-      <w:proofErr w:type="spellStart"/>
-      <w:r>
-        <w:t>CityPoint</w:t>
-      </w:r>
-      <w:proofErr w:type="spellEnd"/>
-      <w:r>
-        <w:t xml:space="preserve"> Room Hire’s services.</w:t>
-      </w:r>
-    </w:p>
-    <w:p>
-      <w:pPr>
-        <w:pStyle w:val="ListParagraph"/>
-        <w:numPr>
-          <w:ilvl w:val="0"/>
-          <w:numId w:val="8"/>
-        </w:numPr>
-      </w:pPr>
-      <w:r>
-        <w:t>Ensuring theme toggle button works correctly, since it currently does not work expectedly and change the website to be less aesthetically pleasing and even unreadable in some places. This can result in users having bad user experience and leave bad ratings for the company</w:t>
-      </w:r>
-      <w:r>
-        <w:t>. Which means the client will a have a worse reputation and that is not good for growing their business.</w:t>
-      </w:r>
-    </w:p>
-    <w:p>
-      <w:pPr>
-        <w:pStyle w:val="ListParagraph"/>
-        <w:numPr>
-          <w:ilvl w:val="0"/>
-          <w:numId w:val="8"/>
-        </w:numPr>
-      </w:pPr>
-      <w:r>
-        <w:t>The website does not change its layout on different devices which means it will exclude a lot of users that do not use a desktop to book a room. This will make it hard for the client to grow their company as they cannot get customers to use their online booking solution.</w:t>
-      </w:r>
-    </w:p>
-    <w:p>
-      <w:pPr>
-        <w:pStyle w:val="ListParagraph"/>
-        <w:numPr>
-          <w:ilvl w:val="0"/>
-          <w:numId w:val="8"/>
-        </w:numPr>
-      </w:pPr>
-      <w:r>
-        <w:t xml:space="preserve">The solution should handle data </w:t>
-      </w:r>
-      <w:r>
-        <w:t>more efficiently, so that the customers can get a better user experience when data is being loaded. If there is delays in loading webpages due to large data being loaded inefficiently then users will become frustrated with the solution and lead to less users using the solution.</w:t>
-      </w:r>
     </w:p>
     <w:sectPr>
       <w:pgSz w:w="11906" w:h="16838"/>
@@ -2380,7 +3026,7 @@
 </file>
 
 <file path=word/numbering.xml><?xml version="1.0" encoding="utf-8"?>
-<w:numbering xmlns:wpc="http://schemas.microsoft.com/office/word/2010/wordprocessingCanvas" xmlns:cx="http://schemas.microsoft.com/office/drawing/2014/chartex" xmlns:cx1="http://schemas.microsoft.com/office/drawing/2015/9/8/chartex" xmlns:cx2="http://schemas.microsoft.com/office/drawing/2015/10/21/chartex" xmlns:cx3="http://schemas.microsoft.com/office/drawing/2016/5/9/chartex" xmlns:cx4="http://schemas.microsoft.com/office/drawing/2016/5/10/chartex" xmlns:cx5="http://schemas.microsoft.com/office/drawing/2016/5/11/chartex" xmlns:cx6="http://schemas.microsoft.com/office/drawing/2016/5/12/chartex" xmlns:cx7="http://schemas.microsoft.com/office/drawing/2016/5/13/chartex" xmlns:cx8="http://schemas.microsoft.com/office/drawing/2016/5/14/chartex" xmlns:mc="http://schemas.openxmlformats.org/markup-compatibility/2006" xmlns:aink="http://schemas.microsoft.com/office/drawing/2016/ink" xmlns:am3d="http://schemas.microsoft.com/office/drawing/2017/model3d" xmlns:o="urn:schemas-microsoft-com:office:office" xmlns:r="http://schemas.openxmlformats.org/officeDocument/2006/relationships" xmlns:m="http://schemas.openxmlformats.org/officeDocument/2006/math" xmlns:v="urn:schemas-microsoft-com:vml" xmlns:wp14="http://schemas.microsoft.com/office/word/2010/wordprocessingDrawing" xmlns:wp="http://schemas.openxmlformats.org/drawingml/2006/wordprocessingDrawing" xmlns:w10="urn:schemas-microsoft-com:office:word" xmlns:w="http://schemas.openxmlformats.org/wordprocessingml/2006/main" xmlns:w14="http://schemas.microsoft.com/office/word/2010/wordml" xmlns:w15="http://schemas.microsoft.com/office/word/2012/wordml" xmlns:w16cex="http://schemas.microsoft.com/office/word/2018/wordml/cex" xmlns:w16cid="http://schemas.microsoft.com/office/word/2016/wordml/cid" xmlns:w16="http://schemas.microsoft.com/office/word/2018/wordml" xmlns:w16sdtdh="http://schemas.microsoft.com/office/word/2020/wordml/sdtdatahash" xmlns:w16se="http://schemas.microsoft.com/office/word/2015/wordml/symex" xmlns:wpg="http://schemas.microsoft.com/office/word/2010/wordprocessingGroup" xmlns:wpi="http://schemas.microsoft.com/office/word/2010/wordprocessingInk" xmlns:wne="http://schemas.microsoft.com/office/word/2006/wordml" xmlns:wps="http://schemas.microsoft.com/office/word/2010/wordprocessingShape" mc:Ignorable="w14 w15 w16se w16cid w16 w16cex w16sdtdh wp14">
+<w:numbering xmlns:wpc="http://schemas.microsoft.com/office/word/2010/wordprocessingCanvas" xmlns:cx="http://schemas.microsoft.com/office/drawing/2014/chartex" xmlns:cx1="http://schemas.microsoft.com/office/drawing/2015/9/8/chartex" xmlns:cx2="http://schemas.microsoft.com/office/drawing/2015/10/21/chartex" xmlns:cx3="http://schemas.microsoft.com/office/drawing/2016/5/9/chartex" xmlns:cx4="http://schemas.microsoft.com/office/drawing/2016/5/10/chartex" xmlns:cx5="http://schemas.microsoft.com/office/drawing/2016/5/11/chartex" xmlns:cx6="http://schemas.microsoft.com/office/drawing/2016/5/12/chartex" xmlns:cx7="http://schemas.microsoft.com/office/drawing/2016/5/13/chartex" xmlns:cx8="http://schemas.microsoft.com/office/drawing/2016/5/14/chartex" xmlns:mc="http://schemas.openxmlformats.org/markup-compatibility/2006" xmlns:aink="http://schemas.microsoft.com/office/drawing/2016/ink" xmlns:am3d="http://schemas.microsoft.com/office/drawing/2017/model3d" xmlns:o="urn:schemas-microsoft-com:office:office" xmlns:oel="http://schemas.microsoft.com/office/2019/extlst" xmlns:r="http://schemas.openxmlformats.org/officeDocument/2006/relationships" xmlns:m="http://schemas.openxmlformats.org/officeDocument/2006/math" xmlns:v="urn:schemas-microsoft-com:vml" xmlns:wp14="http://schemas.microsoft.com/office/word/2010/wordprocessingDrawing" xmlns:wp="http://schemas.openxmlformats.org/drawingml/2006/wordprocessingDrawing" xmlns:w10="urn:schemas-microsoft-com:office:word" xmlns:w="http://schemas.openxmlformats.org/wordprocessingml/2006/main" xmlns:w14="http://schemas.microsoft.com/office/word/2010/wordml" xmlns:w15="http://schemas.microsoft.com/office/word/2012/wordml" xmlns:w16cex="http://schemas.microsoft.com/office/word/2018/wordml/cex" xmlns:w16cid="http://schemas.microsoft.com/office/word/2016/wordml/cid" xmlns:w16="http://schemas.microsoft.com/office/word/2018/wordml" xmlns:w16du="http://schemas.microsoft.com/office/word/2023/wordml/word16du" xmlns:w16sdtdh="http://schemas.microsoft.com/office/word/2020/wordml/sdtdatahash" xmlns:w16sdtfl="http://schemas.microsoft.com/office/word/2024/wordml/sdtformatlock" xmlns:w16se="http://schemas.microsoft.com/office/word/2015/wordml/symex" xmlns:wpg="http://schemas.microsoft.com/office/word/2010/wordprocessingGroup" xmlns:wpi="http://schemas.microsoft.com/office/word/2010/wordprocessingInk" xmlns:wne="http://schemas.microsoft.com/office/word/2006/wordml" xmlns:wps="http://schemas.microsoft.com/office/word/2010/wordprocessingShape" mc:Ignorable="w14 w15 w16se w16cid w16 w16cex w16sdtdh w16sdtfl w16du wp14">
   <w:abstractNum w:abstractNumId="0" w15:restartNumberingAfterBreak="0">
     <w:nsid w:val="09946DDD"/>
     <w:multiLevelType w:val="hybridMultilevel"/>
@@ -2807,6 +3453,92 @@
     </w:lvl>
   </w:abstractNum>
   <w:abstractNum w:abstractNumId="4" w15:restartNumberingAfterBreak="0">
+    <w:nsid w:val="2F062B70"/>
+    <w:multiLevelType w:val="hybridMultilevel"/>
+    <w:tmpl w:val="28FA5F32"/>
+    <w:lvl w:ilvl="0" w:tplc="0809000F">
+      <w:start w:val="1"/>
+      <w:numFmt w:val="decimal"/>
+      <w:lvlText w:val="%1."/>
+      <w:lvlJc w:val="left"/>
+      <w:pPr>
+        <w:ind w:left="720" w:hanging="360"/>
+      </w:pPr>
+    </w:lvl>
+    <w:lvl w:ilvl="1" w:tplc="08090019" w:tentative="1">
+      <w:start w:val="1"/>
+      <w:numFmt w:val="lowerLetter"/>
+      <w:lvlText w:val="%2."/>
+      <w:lvlJc w:val="left"/>
+      <w:pPr>
+        <w:ind w:left="1440" w:hanging="360"/>
+      </w:pPr>
+    </w:lvl>
+    <w:lvl w:ilvl="2" w:tplc="0809001B" w:tentative="1">
+      <w:start w:val="1"/>
+      <w:numFmt w:val="lowerRoman"/>
+      <w:lvlText w:val="%3."/>
+      <w:lvlJc w:val="right"/>
+      <w:pPr>
+        <w:ind w:left="2160" w:hanging="180"/>
+      </w:pPr>
+    </w:lvl>
+    <w:lvl w:ilvl="3" w:tplc="0809000F" w:tentative="1">
+      <w:start w:val="1"/>
+      <w:numFmt w:val="decimal"/>
+      <w:lvlText w:val="%4."/>
+      <w:lvlJc w:val="left"/>
+      <w:pPr>
+        <w:ind w:left="2880" w:hanging="360"/>
+      </w:pPr>
+    </w:lvl>
+    <w:lvl w:ilvl="4" w:tplc="08090019" w:tentative="1">
+      <w:start w:val="1"/>
+      <w:numFmt w:val="lowerLetter"/>
+      <w:lvlText w:val="%5."/>
+      <w:lvlJc w:val="left"/>
+      <w:pPr>
+        <w:ind w:left="3600" w:hanging="360"/>
+      </w:pPr>
+    </w:lvl>
+    <w:lvl w:ilvl="5" w:tplc="0809001B" w:tentative="1">
+      <w:start w:val="1"/>
+      <w:numFmt w:val="lowerRoman"/>
+      <w:lvlText w:val="%6."/>
+      <w:lvlJc w:val="right"/>
+      <w:pPr>
+        <w:ind w:left="4320" w:hanging="180"/>
+      </w:pPr>
+    </w:lvl>
+    <w:lvl w:ilvl="6" w:tplc="0809000F" w:tentative="1">
+      <w:start w:val="1"/>
+      <w:numFmt w:val="decimal"/>
+      <w:lvlText w:val="%7."/>
+      <w:lvlJc w:val="left"/>
+      <w:pPr>
+        <w:ind w:left="5040" w:hanging="360"/>
+      </w:pPr>
+    </w:lvl>
+    <w:lvl w:ilvl="7" w:tplc="08090019" w:tentative="1">
+      <w:start w:val="1"/>
+      <w:numFmt w:val="lowerLetter"/>
+      <w:lvlText w:val="%8."/>
+      <w:lvlJc w:val="left"/>
+      <w:pPr>
+        <w:ind w:left="5760" w:hanging="360"/>
+      </w:pPr>
+    </w:lvl>
+    <w:lvl w:ilvl="8" w:tplc="0809001B" w:tentative="1">
+      <w:start w:val="1"/>
+      <w:numFmt w:val="lowerRoman"/>
+      <w:lvlText w:val="%9."/>
+      <w:lvlJc w:val="right"/>
+      <w:pPr>
+        <w:ind w:left="6480" w:hanging="180"/>
+      </w:pPr>
+    </w:lvl>
+  </w:abstractNum>
+  <w:abstractNum w:abstractNumId="5" w15:restartNumberingAfterBreak="0">
     <w:nsid w:val="4228F815"/>
     <w:multiLevelType w:val="hybridMultilevel"/>
     <w:tmpl w:val="E8E068CC"/>
@@ -2919,7 +3651,7 @@
       </w:rPr>
     </w:lvl>
   </w:abstractNum>
-  <w:abstractNum w:abstractNumId="5" w15:restartNumberingAfterBreak="0">
+  <w:abstractNum w:abstractNumId="6" w15:restartNumberingAfterBreak="0">
     <w:nsid w:val="59F6992F"/>
     <w:multiLevelType w:val="hybridMultilevel"/>
     <w:tmpl w:val="60609ACC"/>
@@ -3032,7 +3764,7 @@
       </w:rPr>
     </w:lvl>
   </w:abstractNum>
-  <w:abstractNum w:abstractNumId="6" w15:restartNumberingAfterBreak="0">
+  <w:abstractNum w:abstractNumId="7" w15:restartNumberingAfterBreak="0">
     <w:nsid w:val="758F4D71"/>
     <w:multiLevelType w:val="hybridMultilevel"/>
     <w:tmpl w:val="C7024BA2"/>
@@ -3145,7 +3877,7 @@
       </w:rPr>
     </w:lvl>
   </w:abstractNum>
-  <w:abstractNum w:abstractNumId="7" w15:restartNumberingAfterBreak="0">
+  <w:abstractNum w:abstractNumId="8" w15:restartNumberingAfterBreak="0">
     <w:nsid w:val="7866F563"/>
     <w:multiLevelType w:val="hybridMultilevel"/>
     <w:tmpl w:val="ECB8F358"/>
@@ -3258,98 +3990,38 @@
       </w:rPr>
     </w:lvl>
   </w:abstractNum>
-  <w:num w:numId="1">
+  <w:num w:numId="1" w16cid:durableId="1897618348">
     <w:abstractNumId w:val="3"/>
-    <w:lvlOverride w:ilvl="0"/>
-    <w:lvlOverride w:ilvl="1"/>
-    <w:lvlOverride w:ilvl="2"/>
-    <w:lvlOverride w:ilvl="3"/>
-    <w:lvlOverride w:ilvl="4"/>
-    <w:lvlOverride w:ilvl="5"/>
-    <w:lvlOverride w:ilvl="6"/>
-    <w:lvlOverride w:ilvl="7"/>
-    <w:lvlOverride w:ilvl="8"/>
   </w:num>
-  <w:num w:numId="2">
+  <w:num w:numId="2" w16cid:durableId="1967466987">
+    <w:abstractNumId w:val="7"/>
+  </w:num>
+  <w:num w:numId="3" w16cid:durableId="1853837043">
     <w:abstractNumId w:val="6"/>
-    <w:lvlOverride w:ilvl="0"/>
-    <w:lvlOverride w:ilvl="1"/>
-    <w:lvlOverride w:ilvl="2"/>
-    <w:lvlOverride w:ilvl="3"/>
-    <w:lvlOverride w:ilvl="4"/>
-    <w:lvlOverride w:ilvl="5"/>
-    <w:lvlOverride w:ilvl="6"/>
-    <w:lvlOverride w:ilvl="7"/>
-    <w:lvlOverride w:ilvl="8"/>
   </w:num>
-  <w:num w:numId="3">
+  <w:num w:numId="4" w16cid:durableId="1149131694">
     <w:abstractNumId w:val="5"/>
-    <w:lvlOverride w:ilvl="0"/>
-    <w:lvlOverride w:ilvl="1"/>
-    <w:lvlOverride w:ilvl="2"/>
-    <w:lvlOverride w:ilvl="3"/>
-    <w:lvlOverride w:ilvl="4"/>
-    <w:lvlOverride w:ilvl="5"/>
-    <w:lvlOverride w:ilvl="6"/>
-    <w:lvlOverride w:ilvl="7"/>
-    <w:lvlOverride w:ilvl="8"/>
   </w:num>
-  <w:num w:numId="4">
+  <w:num w:numId="5" w16cid:durableId="1506093752">
+    <w:abstractNumId w:val="2"/>
+  </w:num>
+  <w:num w:numId="6" w16cid:durableId="1841391034">
+    <w:abstractNumId w:val="0"/>
+  </w:num>
+  <w:num w:numId="7" w16cid:durableId="1316377336">
+    <w:abstractNumId w:val="8"/>
+  </w:num>
+  <w:num w:numId="8" w16cid:durableId="268703374">
+    <w:abstractNumId w:val="1"/>
+  </w:num>
+  <w:num w:numId="9" w16cid:durableId="417599653">
     <w:abstractNumId w:val="4"/>
-    <w:lvlOverride w:ilvl="0"/>
-    <w:lvlOverride w:ilvl="1"/>
-    <w:lvlOverride w:ilvl="2"/>
-    <w:lvlOverride w:ilvl="3"/>
-    <w:lvlOverride w:ilvl="4"/>
-    <w:lvlOverride w:ilvl="5"/>
-    <w:lvlOverride w:ilvl="6"/>
-    <w:lvlOverride w:ilvl="7"/>
-    <w:lvlOverride w:ilvl="8"/>
-  </w:num>
-  <w:num w:numId="5">
-    <w:abstractNumId w:val="2"/>
-    <w:lvlOverride w:ilvl="0"/>
-    <w:lvlOverride w:ilvl="1"/>
-    <w:lvlOverride w:ilvl="2"/>
-    <w:lvlOverride w:ilvl="3"/>
-    <w:lvlOverride w:ilvl="4"/>
-    <w:lvlOverride w:ilvl="5"/>
-    <w:lvlOverride w:ilvl="6"/>
-    <w:lvlOverride w:ilvl="7"/>
-    <w:lvlOverride w:ilvl="8"/>
-  </w:num>
-  <w:num w:numId="6">
-    <w:abstractNumId w:val="0"/>
-    <w:lvlOverride w:ilvl="0"/>
-    <w:lvlOverride w:ilvl="1"/>
-    <w:lvlOverride w:ilvl="2"/>
-    <w:lvlOverride w:ilvl="3"/>
-    <w:lvlOverride w:ilvl="4"/>
-    <w:lvlOverride w:ilvl="5"/>
-    <w:lvlOverride w:ilvl="6"/>
-    <w:lvlOverride w:ilvl="7"/>
-    <w:lvlOverride w:ilvl="8"/>
-  </w:num>
-  <w:num w:numId="7">
-    <w:abstractNumId w:val="7"/>
-    <w:lvlOverride w:ilvl="0"/>
-    <w:lvlOverride w:ilvl="1"/>
-    <w:lvlOverride w:ilvl="2"/>
-    <w:lvlOverride w:ilvl="3"/>
-    <w:lvlOverride w:ilvl="4"/>
-    <w:lvlOverride w:ilvl="5"/>
-    <w:lvlOverride w:ilvl="6"/>
-    <w:lvlOverride w:ilvl="7"/>
-    <w:lvlOverride w:ilvl="8"/>
-  </w:num>
-  <w:num w:numId="8">
-    <w:abstractNumId w:val="1"/>
   </w:num>
 </w:numbering>
 </file>
 
 <file path=word/styles.xml><?xml version="1.0" encoding="utf-8"?>
-<w:styles xmlns:mc="http://schemas.openxmlformats.org/markup-compatibility/2006" xmlns:r="http://schemas.openxmlformats.org/officeDocument/2006/relationships" xmlns:w="http://schemas.openxmlformats.org/wordprocessingml/2006/main" xmlns:w14="http://schemas.microsoft.com/office/word/2010/wordml" xmlns:w15="http://schemas.microsoft.com/office/word/2012/wordml" xmlns:w16cex="http://schemas.microsoft.com/office/word/2018/wordml/cex" xmlns:w16cid="http://schemas.microsoft.com/office/word/2016/wordml/cid" xmlns:w16="http://schemas.microsoft.com/office/word/2018/wordml" xmlns:w16sdtdh="http://schemas.microsoft.com/office/word/2020/wordml/sdtdatahash" xmlns:w16se="http://schemas.microsoft.com/office/word/2015/wordml/symex" mc:Ignorable="w14 w15 w16se w16cid w16 w16cex w16sdtdh">
+<w:styles xmlns:mc="http://schemas.openxmlformats.org/markup-compatibility/2006" xmlns:r="http://schemas.openxmlformats.org/officeDocument/2006/relationships" xmlns:w="http://schemas.openxmlformats.org/wordprocessingml/2006/main" xmlns:w14="http://schemas.microsoft.com/office/word/2010/wordml" xmlns:w15="http://schemas.microsoft.com/office/word/2012/wordml" xmlns:w16cex="http://schemas.microsoft.com/office/word/2018/wordml/cex" xmlns:w16cid="http://schemas.microsoft.com/office/word/2016/wordml/cid" xmlns:w16="http://schemas.microsoft.com/office/word/2018/wordml" xmlns:w16du="http://schemas.microsoft.com/office/word/2023/wordml/word16du" xmlns:w16sdtdh="http://schemas.microsoft.com/office/word/2020/wordml/sdtdatahash" xmlns:w16sdtfl="http://schemas.microsoft.com/office/word/2024/wordml/sdtformatlock" xmlns:w16se="http://schemas.microsoft.com/office/word/2015/wordml/symex" mc:Ignorable="w14 w15 w16se w16cid w16 w16cex w16sdtdh w16sdtfl w16du">
   <w:docDefaults>
     <w:rPrDefault>
       <w:rPr>
@@ -3980,7 +4652,7 @@
 </file>
 
 <file path=word/glossary/document.xml><?xml version="1.0" encoding="utf-8"?>
-<w:glossaryDocument xmlns:wpc="http://schemas.microsoft.com/office/word/2010/wordprocessingCanvas" xmlns:cx="http://schemas.microsoft.com/office/drawing/2014/chartex" xmlns:cx1="http://schemas.microsoft.com/office/drawing/2015/9/8/chartex" xmlns:cx2="http://schemas.microsoft.com/office/drawing/2015/10/21/chartex" xmlns:cx3="http://schemas.microsoft.com/office/drawing/2016/5/9/chartex" xmlns:cx4="http://schemas.microsoft.com/office/drawing/2016/5/10/chartex" xmlns:cx5="http://schemas.microsoft.com/office/drawing/2016/5/11/chartex" xmlns:cx6="http://schemas.microsoft.com/office/drawing/2016/5/12/chartex" xmlns:cx7="http://schemas.microsoft.com/office/drawing/2016/5/13/chartex" xmlns:cx8="http://schemas.microsoft.com/office/drawing/2016/5/14/chartex" xmlns:mc="http://schemas.openxmlformats.org/markup-compatibility/2006" xmlns:aink="http://schemas.microsoft.com/office/drawing/2016/ink" xmlns:am3d="http://schemas.microsoft.com/office/drawing/2017/model3d" xmlns:o="urn:schemas-microsoft-com:office:office" xmlns:r="http://schemas.openxmlformats.org/officeDocument/2006/relationships" xmlns:m="http://schemas.openxmlformats.org/officeDocument/2006/math" xmlns:v="urn:schemas-microsoft-com:vml" xmlns:wp14="http://schemas.microsoft.com/office/word/2010/wordprocessingDrawing" xmlns:wp="http://schemas.openxmlformats.org/drawingml/2006/wordprocessingDrawing" xmlns:w10="urn:schemas-microsoft-com:office:word" xmlns:w="http://schemas.openxmlformats.org/wordprocessingml/2006/main" xmlns:w14="http://schemas.microsoft.com/office/word/2010/wordml" xmlns:w15="http://schemas.microsoft.com/office/word/2012/wordml" xmlns:w16cex="http://schemas.microsoft.com/office/word/2018/wordml/cex" xmlns:w16cid="http://schemas.microsoft.com/office/word/2016/wordml/cid" xmlns:w16="http://schemas.microsoft.com/office/word/2018/wordml" xmlns:w16sdtdh="http://schemas.microsoft.com/office/word/2020/wordml/sdtdatahash" xmlns:w16se="http://schemas.microsoft.com/office/word/2015/wordml/symex" xmlns:wpg="http://schemas.microsoft.com/office/word/2010/wordprocessingGroup" xmlns:wpi="http://schemas.microsoft.com/office/word/2010/wordprocessingInk" xmlns:wne="http://schemas.microsoft.com/office/word/2006/wordml" xmlns:wps="http://schemas.microsoft.com/office/word/2010/wordprocessingShape" mc:Ignorable="w14 w15 w16se w16cid w16 w16cex w16sdtdh wp14">
+<w:glossaryDocument xmlns:wpc="http://schemas.microsoft.com/office/word/2010/wordprocessingCanvas" xmlns:cx="http://schemas.microsoft.com/office/drawing/2014/chartex" xmlns:cx1="http://schemas.microsoft.com/office/drawing/2015/9/8/chartex" xmlns:cx2="http://schemas.microsoft.com/office/drawing/2015/10/21/chartex" xmlns:cx3="http://schemas.microsoft.com/office/drawing/2016/5/9/chartex" xmlns:cx4="http://schemas.microsoft.com/office/drawing/2016/5/10/chartex" xmlns:cx5="http://schemas.microsoft.com/office/drawing/2016/5/11/chartex" xmlns:cx6="http://schemas.microsoft.com/office/drawing/2016/5/12/chartex" xmlns:cx7="http://schemas.microsoft.com/office/drawing/2016/5/13/chartex" xmlns:cx8="http://schemas.microsoft.com/office/drawing/2016/5/14/chartex" xmlns:mc="http://schemas.openxmlformats.org/markup-compatibility/2006" xmlns:aink="http://schemas.microsoft.com/office/drawing/2016/ink" xmlns:am3d="http://schemas.microsoft.com/office/drawing/2017/model3d" xmlns:o="urn:schemas-microsoft-com:office:office" xmlns:oel="http://schemas.microsoft.com/office/2019/extlst" xmlns:r="http://schemas.openxmlformats.org/officeDocument/2006/relationships" xmlns:m="http://schemas.openxmlformats.org/officeDocument/2006/math" xmlns:v="urn:schemas-microsoft-com:vml" xmlns:wp14="http://schemas.microsoft.com/office/word/2010/wordprocessingDrawing" xmlns:wp="http://schemas.openxmlformats.org/drawingml/2006/wordprocessingDrawing" xmlns:w10="urn:schemas-microsoft-com:office:word" xmlns:w="http://schemas.openxmlformats.org/wordprocessingml/2006/main" xmlns:w14="http://schemas.microsoft.com/office/word/2010/wordml" xmlns:w15="http://schemas.microsoft.com/office/word/2012/wordml" xmlns:w16cex="http://schemas.microsoft.com/office/word/2018/wordml/cex" xmlns:w16cid="http://schemas.microsoft.com/office/word/2016/wordml/cid" xmlns:w16="http://schemas.microsoft.com/office/word/2018/wordml" xmlns:w16du="http://schemas.microsoft.com/office/word/2023/wordml/word16du" xmlns:w16sdtdh="http://schemas.microsoft.com/office/word/2020/wordml/sdtdatahash" xmlns:w16sdtfl="http://schemas.microsoft.com/office/word/2024/wordml/sdtformatlock" xmlns:w16se="http://schemas.microsoft.com/office/word/2015/wordml/symex" xmlns:wpg="http://schemas.microsoft.com/office/word/2010/wordprocessingGroup" xmlns:wpi="http://schemas.microsoft.com/office/word/2010/wordprocessingInk" xmlns:wne="http://schemas.microsoft.com/office/word/2006/wordml" xmlns:wps="http://schemas.microsoft.com/office/word/2010/wordprocessingShape" mc:Ignorable="w14 w15 w16se w16cid w16 w16cex w16sdtdh w16sdtfl w16du wp14">
   <w:docParts>
     <w:docPart>
       <w:docPartPr>
@@ -4020,21 +4692,20 @@
 </file>
 
 <file path=word/glossary/fontTable.xml><?xml version="1.0" encoding="utf-8"?>
-<w:fonts xmlns:mc="http://schemas.openxmlformats.org/markup-compatibility/2006" xmlns:r="http://schemas.openxmlformats.org/officeDocument/2006/relationships" xmlns:w="http://schemas.openxmlformats.org/wordprocessingml/2006/main" xmlns:w14="http://schemas.microsoft.com/office/word/2010/wordml" xmlns:w15="http://schemas.microsoft.com/office/word/2012/wordml" xmlns:w16cex="http://schemas.microsoft.com/office/word/2018/wordml/cex" xmlns:w16cid="http://schemas.microsoft.com/office/word/2016/wordml/cid" xmlns:w16="http://schemas.microsoft.com/office/word/2018/wordml" xmlns:w16sdtdh="http://schemas.microsoft.com/office/word/2020/wordml/sdtdatahash" xmlns:w16se="http://schemas.microsoft.com/office/word/2015/wordml/symex" mc:Ignorable="w14 w15 w16se w16cid w16 w16cex w16sdtdh">
+<w:fonts xmlns:mc="http://schemas.openxmlformats.org/markup-compatibility/2006" xmlns:r="http://schemas.openxmlformats.org/officeDocument/2006/relationships" xmlns:w="http://schemas.openxmlformats.org/wordprocessingml/2006/main" xmlns:w14="http://schemas.microsoft.com/office/word/2010/wordml" xmlns:w15="http://schemas.microsoft.com/office/word/2012/wordml" xmlns:w16cex="http://schemas.microsoft.com/office/word/2018/wordml/cex" xmlns:w16cid="http://schemas.microsoft.com/office/word/2016/wordml/cid" xmlns:w16="http://schemas.microsoft.com/office/word/2018/wordml" xmlns:w16du="http://schemas.microsoft.com/office/word/2023/wordml/word16du" xmlns:w16sdtdh="http://schemas.microsoft.com/office/word/2020/wordml/sdtdatahash" xmlns:w16sdtfl="http://schemas.microsoft.com/office/word/2024/wordml/sdtformatlock" xmlns:w16se="http://schemas.microsoft.com/office/word/2015/wordml/symex" mc:Ignorable="w14 w15 w16se w16cid w16 w16cex w16sdtdh w16sdtfl w16du">
   <w:font w:name="Calibri">
-    <w:altName w:val="Calibri"/>
     <w:panose1 w:val="020F0502020204030204"/>
     <w:charset w:val="00"/>
     <w:family w:val="swiss"/>
     <w:pitch w:val="variable"/>
-    <w:sig w:usb0="E0002AFF" w:usb1="4000ACFF" w:usb2="00000001" w:usb3="00000000" w:csb0="000001FF" w:csb1="00000000"/>
+    <w:sig w:usb0="E4002EFF" w:usb1="C200247B" w:usb2="00000009" w:usb3="00000000" w:csb0="000001FF" w:csb1="00000000"/>
   </w:font>
   <w:font w:name="Times New Roman">
     <w:panose1 w:val="02020603050405020304"/>
     <w:charset w:val="00"/>
     <w:family w:val="roman"/>
     <w:pitch w:val="variable"/>
-    <w:sig w:usb0="E0002AFF" w:usb1="C0007843" w:usb2="00000009" w:usb3="00000000" w:csb0="000001FF" w:csb1="00000000"/>
+    <w:sig w:usb0="E0002EFF" w:usb1="C000785B" w:usb2="00000009" w:usb3="00000000" w:csb0="000001FF" w:csb1="00000000"/>
   </w:font>
   <w:font w:name="Courier New">
     <w:panose1 w:val="02070309020205020404"/>
@@ -4062,13 +4733,13 @@
     <w:charset w:val="00"/>
     <w:family w:val="swiss"/>
     <w:pitch w:val="variable"/>
-    <w:sig w:usb0="A0002AEF" w:usb1="4000207B" w:usb2="00000000" w:usb3="00000000" w:csb0="000001FF" w:csb1="00000000"/>
+    <w:sig w:usb0="E4002EFF" w:usb1="C200247B" w:usb2="00000009" w:usb3="00000000" w:csb0="000001FF" w:csb1="00000000"/>
   </w:font>
 </w:fonts>
 </file>
 
 <file path=word/glossary/settings.xml><?xml version="1.0" encoding="utf-8"?>
-<w:settings xmlns:mc="http://schemas.openxmlformats.org/markup-compatibility/2006" xmlns:o="urn:schemas-microsoft-com:office:office" xmlns:r="http://schemas.openxmlformats.org/officeDocument/2006/relationships" xmlns:m="http://schemas.openxmlformats.org/officeDocument/2006/math" xmlns:v="urn:schemas-microsoft-com:vml" xmlns:w10="urn:schemas-microsoft-com:office:word" xmlns:w="http://schemas.openxmlformats.org/wordprocessingml/2006/main" xmlns:w14="http://schemas.microsoft.com/office/word/2010/wordml" xmlns:w15="http://schemas.microsoft.com/office/word/2012/wordml" xmlns:w16cex="http://schemas.microsoft.com/office/word/2018/wordml/cex" xmlns:w16cid="http://schemas.microsoft.com/office/word/2016/wordml/cid" xmlns:w16="http://schemas.microsoft.com/office/word/2018/wordml" xmlns:w16sdtdh="http://schemas.microsoft.com/office/word/2020/wordml/sdtdatahash" xmlns:w16se="http://schemas.microsoft.com/office/word/2015/wordml/symex" xmlns:sl="http://schemas.openxmlformats.org/schemaLibrary/2006/main" mc:Ignorable="w14 w15 w16se w16cid w16 w16cex w16sdtdh">
+<w:settings xmlns:mc="http://schemas.openxmlformats.org/markup-compatibility/2006" xmlns:o="urn:schemas-microsoft-com:office:office" xmlns:r="http://schemas.openxmlformats.org/officeDocument/2006/relationships" xmlns:m="http://schemas.openxmlformats.org/officeDocument/2006/math" xmlns:v="urn:schemas-microsoft-com:vml" xmlns:w10="urn:schemas-microsoft-com:office:word" xmlns:w="http://schemas.openxmlformats.org/wordprocessingml/2006/main" xmlns:w14="http://schemas.microsoft.com/office/word/2010/wordml" xmlns:w15="http://schemas.microsoft.com/office/word/2012/wordml" xmlns:w16cex="http://schemas.microsoft.com/office/word/2018/wordml/cex" xmlns:w16cid="http://schemas.microsoft.com/office/word/2016/wordml/cid" xmlns:w16="http://schemas.microsoft.com/office/word/2018/wordml" xmlns:w16du="http://schemas.microsoft.com/office/word/2023/wordml/word16du" xmlns:w16sdtdh="http://schemas.microsoft.com/office/word/2020/wordml/sdtdatahash" xmlns:w16sdtfl="http://schemas.microsoft.com/office/word/2024/wordml/sdtformatlock" xmlns:w16se="http://schemas.microsoft.com/office/word/2015/wordml/symex" xmlns:sl="http://schemas.openxmlformats.org/schemaLibrary/2006/main" mc:Ignorable="w14 w15 w16se w16cid w16 w16cex w16sdtdh w16sdtfl w16du">
   <w:view w:val="normal"/>
   <w:defaultTabStop w:val="720"/>
   <w:characterSpacingControl w:val="doNotCompress"/>
@@ -4084,6 +4755,9 @@
   <w:rsids>
     <w:rsidRoot w:val="00455CEF"/>
     <w:rsid w:val="00455CEF"/>
+    <w:rsid w:val="00540361"/>
+    <w:rsid w:val="00A725BF"/>
+    <w:rsid w:val="00B75320"/>
   </w:rsids>
   <m:mathPr>
     <m:mathFont m:val="Cambria Math"/>
@@ -4107,7 +4781,7 @@
 </file>
 
 <file path=word/glossary/styles.xml><?xml version="1.0" encoding="utf-8"?>
-<w:styles xmlns:mc="http://schemas.openxmlformats.org/markup-compatibility/2006" xmlns:r="http://schemas.openxmlformats.org/officeDocument/2006/relationships" xmlns:w="http://schemas.openxmlformats.org/wordprocessingml/2006/main" xmlns:w14="http://schemas.microsoft.com/office/word/2010/wordml" xmlns:w15="http://schemas.microsoft.com/office/word/2012/wordml" xmlns:w16cex="http://schemas.microsoft.com/office/word/2018/wordml/cex" xmlns:w16cid="http://schemas.microsoft.com/office/word/2016/wordml/cid" xmlns:w16="http://schemas.microsoft.com/office/word/2018/wordml" xmlns:w16sdtdh="http://schemas.microsoft.com/office/word/2020/wordml/sdtdatahash" xmlns:w16se="http://schemas.microsoft.com/office/word/2015/wordml/symex" mc:Ignorable="w14 w15 w16se w16cid w16 w16cex w16sdtdh">
+<w:styles xmlns:mc="http://schemas.openxmlformats.org/markup-compatibility/2006" xmlns:r="http://schemas.openxmlformats.org/officeDocument/2006/relationships" xmlns:w="http://schemas.openxmlformats.org/wordprocessingml/2006/main" xmlns:w14="http://schemas.microsoft.com/office/word/2010/wordml" xmlns:w15="http://schemas.microsoft.com/office/word/2012/wordml" xmlns:w16cex="http://schemas.microsoft.com/office/word/2018/wordml/cex" xmlns:w16cid="http://schemas.microsoft.com/office/word/2016/wordml/cid" xmlns:w16="http://schemas.microsoft.com/office/word/2018/wordml" xmlns:w16du="http://schemas.microsoft.com/office/word/2023/wordml/word16du" xmlns:w16sdtdh="http://schemas.microsoft.com/office/word/2020/wordml/sdtdatahash" xmlns:w16sdtfl="http://schemas.microsoft.com/office/word/2024/wordml/sdtformatlock" xmlns:w16se="http://schemas.microsoft.com/office/word/2015/wordml/symex" mc:Ignorable="w14 w15 w16se w16cid w16 w16cex w16sdtdh w16sdtfl w16du">
   <w:docDefaults>
     <w:rPrDefault>
       <w:rPr>
@@ -4536,15 +5210,11 @@
     <w:name w:val="CC1B40BBAB6E40618E698842A6B16FFC"/>
     <w:rsid w:val="00455CEF"/>
   </w:style>
-  <w:style w:type="paragraph" w:customStyle="1" w:styleId="20F37AC977C64EB5AC2A2B0A62D1AE93">
-    <w:name w:val="20F37AC977C64EB5AC2A2B0A62D1AE93"/>
-    <w:rsid w:val="00455CEF"/>
-  </w:style>
 </w:styles>
 </file>
 
 <file path=word/glossary/webSettings.xml><?xml version="1.0" encoding="utf-8"?>
-<w:webSettings xmlns:mc="http://schemas.openxmlformats.org/markup-compatibility/2006" xmlns:r="http://schemas.openxmlformats.org/officeDocument/2006/relationships" xmlns:w="http://schemas.openxmlformats.org/wordprocessingml/2006/main" xmlns:w14="http://schemas.microsoft.com/office/word/2010/wordml" xmlns:w15="http://schemas.microsoft.com/office/word/2012/wordml" xmlns:w16cex="http://schemas.microsoft.com/office/word/2018/wordml/cex" xmlns:w16cid="http://schemas.microsoft.com/office/word/2016/wordml/cid" xmlns:w16="http://schemas.microsoft.com/office/word/2018/wordml" xmlns:w16sdtdh="http://schemas.microsoft.com/office/word/2020/wordml/sdtdatahash" xmlns:w16se="http://schemas.microsoft.com/office/word/2015/wordml/symex" mc:Ignorable="w14 w15 w16se w16cid w16 w16cex w16sdtdh">
+<w:webSettings xmlns:mc="http://schemas.openxmlformats.org/markup-compatibility/2006" xmlns:r="http://schemas.openxmlformats.org/officeDocument/2006/relationships" xmlns:w="http://schemas.openxmlformats.org/wordprocessingml/2006/main" xmlns:w14="http://schemas.microsoft.com/office/word/2010/wordml" xmlns:w15="http://schemas.microsoft.com/office/word/2012/wordml" xmlns:w16cex="http://schemas.microsoft.com/office/word/2018/wordml/cex" xmlns:w16cid="http://schemas.microsoft.com/office/word/2016/wordml/cid" xmlns:w16="http://schemas.microsoft.com/office/word/2018/wordml" xmlns:w16du="http://schemas.microsoft.com/office/word/2023/wordml/word16du" xmlns:w16sdtdh="http://schemas.microsoft.com/office/word/2020/wordml/sdtdatahash" xmlns:w16sdtfl="http://schemas.microsoft.com/office/word/2024/wordml/sdtformatlock" xmlns:w16se="http://schemas.microsoft.com/office/word/2015/wordml/symex" mc:Ignorable="w14 w15 w16se w16cid w16 w16cex w16sdtdh w16sdtfl w16du">
   <w:optimizeForBrowser/>
   <w:allowPNG/>
 </w:webSettings>

</xml_diff>

<commit_message>
Added Some Functional Requirements Evaluation
</commit_message>
<xml_diff>
--- a/Task3b_Evaluation_LL-000020908_Ram_D.docx
+++ b/Task3b_Evaluation_LL-000020908_Ram_D.docx
@@ -644,11 +644,9 @@
             <w:tcW w:w="3057" w:type="dxa"/>
           </w:tcPr>
           <w:p>
-            <w:proofErr w:type="spellStart"/>
             <w:r>
               <w:t>sophie</w:t>
             </w:r>
-            <w:proofErr w:type="spellEnd"/>
           </w:p>
         </w:tc>
         <w:tc>
@@ -769,11 +767,9 @@
             <w:tcW w:w="3057" w:type="dxa"/>
           </w:tcPr>
           <w:p>
-            <w:proofErr w:type="spellStart"/>
             <w:r>
               <w:t>emily</w:t>
             </w:r>
-            <w:proofErr w:type="spellEnd"/>
           </w:p>
         </w:tc>
         <w:tc>
@@ -830,11 +826,9 @@
             <w:tcW w:w="3057" w:type="dxa"/>
           </w:tcPr>
           <w:p>
-            <w:proofErr w:type="spellStart"/>
             <w:r>
               <w:t>hero_image</w:t>
             </w:r>
-            <w:proofErr w:type="spellEnd"/>
           </w:p>
         </w:tc>
         <w:tc>
@@ -898,11 +892,9 @@
             <w:tcW w:w="3057" w:type="dxa"/>
           </w:tcPr>
           <w:p>
-            <w:proofErr w:type="spellStart"/>
             <w:r>
               <w:t>cta_image</w:t>
             </w:r>
-            <w:proofErr w:type="spellEnd"/>
           </w:p>
         </w:tc>
         <w:tc>
@@ -1559,7 +1551,11 @@
           <w:tcPr>
             <w:tcW w:w="5488" w:type="dxa"/>
           </w:tcPr>
-          <w:p/>
+          <w:p>
+            <w:r>
+              <w:t>This is met fully because users can log in to their account that they created using their manually created account or using Google.</w:t>
+            </w:r>
+          </w:p>
         </w:tc>
       </w:tr>
       <w:tr>
@@ -1590,7 +1586,11 @@
           <w:tcPr>
             <w:tcW w:w="5488" w:type="dxa"/>
           </w:tcPr>
-          <w:p/>
+          <w:p>
+            <w:r>
+              <w:t>This is met fully as users can navigate to their profile where they can change their email and password.</w:t>
+            </w:r>
+          </w:p>
         </w:tc>
       </w:tr>
       <w:tr>
@@ -1621,7 +1621,17 @@
           <w:tcPr>
             <w:tcW w:w="5488" w:type="dxa"/>
           </w:tcPr>
-          <w:p/>
+          <w:p>
+            <w:r>
+              <w:t xml:space="preserve">This is met fully as there was a complete privacy page containing necessary privacy information for the </w:t>
+            </w:r>
+            <w:r>
+              <w:t>users</w:t>
+            </w:r>
+            <w:r>
+              <w:t xml:space="preserve"> understand how their data is being used according to GDPR.</w:t>
+            </w:r>
+          </w:p>
         </w:tc>
       </w:tr>
       <w:tr>
@@ -1649,7 +1659,15 @@
           <w:tcPr>
             <w:tcW w:w="5488" w:type="dxa"/>
           </w:tcPr>
-          <w:p/>
+          <w:p>
+            <w:r>
+              <w:t xml:space="preserve">This was not met fully since the producers’ methods were not outlined on the producers’ page. In the future these details will be added on, so customers trust the producers </w:t>
+            </w:r>
+            <w:r>
+              <w:lastRenderedPageBreak/>
+              <w:t>working with Greenfield Local Hub and are more likely to buy products from them.</w:t>
+            </w:r>
+          </w:p>
         </w:tc>
       </w:tr>
       <w:tr>
@@ -1659,6 +1677,7 @@
           </w:tcPr>
           <w:p>
             <w:r>
+              <w:lastRenderedPageBreak/>
               <w:t>Customers able to view products with transparent pricing and availability</w:t>
             </w:r>
           </w:p>
@@ -1669,6 +1688,47 @@
           </w:tcPr>
           <w:p>
             <w:r>
+              <w:t>Not fully</w:t>
+            </w:r>
+          </w:p>
+        </w:tc>
+        <w:tc>
+          <w:tcPr>
+            <w:tcW w:w="5488" w:type="dxa"/>
+          </w:tcPr>
+          <w:p>
+            <w:r>
+              <w:t xml:space="preserve">This was </w:t>
+            </w:r>
+            <w:r>
+              <w:t xml:space="preserve">no </w:t>
+            </w:r>
+            <w:r>
+              <w:t xml:space="preserve">met fully </w:t>
+            </w:r>
+            <w:r>
+              <w:t>because the actual prices of the products were shown clear on products page, baskets’ page and the order page. However, the availability was not shown and therefore customers could buy product that was not available. In the future customers should not be able to see or buy product that is not available.</w:t>
+            </w:r>
+          </w:p>
+        </w:tc>
+      </w:tr>
+      <w:tr>
+        <w:tc>
+          <w:tcPr>
+            <w:tcW w:w="3245" w:type="dxa"/>
+          </w:tcPr>
+          <w:p>
+            <w:r>
+              <w:t>Customers able to place orders for collection or delivery</w:t>
+            </w:r>
+          </w:p>
+        </w:tc>
+        <w:tc>
+          <w:tcPr>
+            <w:tcW w:w="1091" w:type="dxa"/>
+          </w:tcPr>
+          <w:p>
+            <w:r>
               <w:t>Yes</w:t>
             </w:r>
           </w:p>
@@ -1677,36 +1737,26 @@
           <w:tcPr>
             <w:tcW w:w="5488" w:type="dxa"/>
           </w:tcPr>
-          <w:p/>
-        </w:tc>
-      </w:tr>
-      <w:tr>
-        <w:tc>
-          <w:tcPr>
-            <w:tcW w:w="3245" w:type="dxa"/>
-          </w:tcPr>
-          <w:p>
-            <w:r>
-              <w:lastRenderedPageBreak/>
-              <w:t>Customers able to place orders for collection or delivery</w:t>
-            </w:r>
-          </w:p>
-        </w:tc>
-        <w:tc>
-          <w:tcPr>
-            <w:tcW w:w="1091" w:type="dxa"/>
-          </w:tcPr>
-          <w:p>
-            <w:r>
-              <w:t>Yes</w:t>
-            </w:r>
-          </w:p>
-        </w:tc>
-        <w:tc>
-          <w:tcPr>
-            <w:tcW w:w="5488" w:type="dxa"/>
-          </w:tcPr>
-          <w:p/>
+          <w:p>
+            <w:r>
+              <w:t>This was met fully because customers can select how they want their order and fill in the relevant information for the order type.</w:t>
+            </w:r>
+            <w:r>
+              <w:t xml:space="preserve"> </w:t>
+            </w:r>
+            <w:r>
+              <w:t>However,</w:t>
+            </w:r>
+            <w:r>
+              <w:t xml:space="preserve"> this could be </w:t>
+            </w:r>
+            <w:r>
+              <w:t>improved</w:t>
+            </w:r>
+            <w:r>
+              <w:t xml:space="preserve"> in the future by allowing more order types.</w:t>
+            </w:r>
+          </w:p>
         </w:tc>
       </w:tr>
       <w:tr>
@@ -2083,6 +2133,7 @@
           </w:tcPr>
           <w:p>
             <w:r>
+              <w:lastRenderedPageBreak/>
               <w:t>CPU usage should not exceed a set amount</w:t>
             </w:r>
           </w:p>
@@ -2164,7 +2215,6 @@
           </w:tcPr>
           <w:p>
             <w:r>
-              <w:lastRenderedPageBreak/>
               <w:t>Input delay should be at or under industry standards</w:t>
             </w:r>
           </w:p>
@@ -2532,6 +2582,7 @@
           </w:tcPr>
           <w:p>
             <w:r>
+              <w:lastRenderedPageBreak/>
               <w:t>There should be explicit user consent for cookies</w:t>
             </w:r>
           </w:p>
@@ -2580,11 +2631,7 @@
           </w:tcPr>
           <w:p>
             <w:r>
-              <w:t xml:space="preserve">Important details like passwords and emails will be replaced with asterisks or dots, these will be the same </w:t>
-            </w:r>
-            <w:r>
-              <w:lastRenderedPageBreak/>
-              <w:t>amount regardless the number of characters.</w:t>
+              <w:t>Important details like passwords and emails will be replaced with asterisks or dots, these will be the same amount regardless the number of characters.</w:t>
             </w:r>
           </w:p>
         </w:tc>
@@ -2594,7 +2641,6 @@
           </w:tcPr>
           <w:p>
             <w:r>
-              <w:lastRenderedPageBreak/>
               <w:t>N/A</w:t>
             </w:r>
           </w:p>
@@ -3024,7 +3070,11 @@
           </w:tcPr>
           <w:p>
             <w:r>
-              <w:t xml:space="preserve">New functions should be added at an industry standard pace to the application </w:t>
+              <w:t xml:space="preserve">New functions should be added at an industry standard </w:t>
+            </w:r>
+            <w:r>
+              <w:lastRenderedPageBreak/>
+              <w:t xml:space="preserve">pace to the application </w:t>
             </w:r>
           </w:p>
         </w:tc>
@@ -3034,11 +3084,13 @@
           </w:tcPr>
           <w:p>
             <w:r>
+              <w:lastRenderedPageBreak/>
               <w:t>On average, every new major function should be added within 5 to 10 days.</w:t>
             </w:r>
           </w:p>
           <w:p>
             <w:r>
+              <w:lastRenderedPageBreak/>
               <w:t>On average, every new minor function should be added within 1 to 3 days.</w:t>
             </w:r>
           </w:p>
@@ -3049,6 +3101,7 @@
           </w:tcPr>
           <w:p>
             <w:r>
+              <w:lastRenderedPageBreak/>
               <w:t>Yes</w:t>
             </w:r>
           </w:p>
@@ -3105,11 +3158,7 @@
           </w:tcPr>
           <w:p>
             <w:r>
-              <w:t xml:space="preserve">The code should be easily maintained </w:t>
-            </w:r>
-            <w:r>
-              <w:lastRenderedPageBreak/>
-              <w:t>and understandable by others.</w:t>
+              <w:t>The code should be easily maintained and understandable by others.</w:t>
             </w:r>
           </w:p>
         </w:tc>
@@ -3119,12 +3168,7 @@
           </w:tcPr>
           <w:p>
             <w:r>
-              <w:lastRenderedPageBreak/>
-              <w:t xml:space="preserve">A third party should be able to understand the coding conventions and logic being </w:t>
-            </w:r>
-            <w:r>
-              <w:lastRenderedPageBreak/>
-              <w:t>used in the solution and edit the code easily after a week of reviewing.</w:t>
+              <w:t>A third party should be able to understand the coding conventions and logic being used in the solution and edit the code easily after a week of reviewing.</w:t>
             </w:r>
           </w:p>
         </w:tc>
@@ -3134,7 +3178,6 @@
           </w:tcPr>
           <w:p>
             <w:r>
-              <w:lastRenderedPageBreak/>
               <w:t>Yes</w:t>
             </w:r>
           </w:p>
@@ -5202,6 +5245,7 @@
   </w:compat>
   <w:rsids>
     <w:rsidRoot w:val="00455CEF"/>
+    <w:rsid w:val="001E74CD"/>
     <w:rsid w:val="00381446"/>
     <w:rsid w:val="00455CEF"/>
     <w:rsid w:val="00540361"/>
@@ -5209,7 +5253,6 @@
     <w:rsid w:val="00AA718E"/>
     <w:rsid w:val="00B75320"/>
     <w:rsid w:val="00B976AF"/>
-    <w:rsid w:val="00C652BB"/>
     <w:rsid w:val="00F24E7C"/>
   </w:rsids>
   <m:mathPr>

</xml_diff>

<commit_message>
Added All Non-Functional Requirements Evaluation
</commit_message>
<xml_diff>
--- a/Task3b_Evaluation_LL-000020908_Ram_D.docx
+++ b/Task3b_Evaluation_LL-000020908_Ram_D.docx
@@ -262,7 +262,7 @@
                     <v:stroke joinstyle="miter"/>
                     <v:path gradientshapeok="t" o:connecttype="rect"/>
                   </v:shapetype>
-                  <v:shape id="Text Box 142" o:spid="_x0000_s1026" type="#_x0000_t202" style="position:absolute;left:0;text-align:left;margin-left:0;margin-top:0;width:516pt;height:43.9pt;z-index:251659264;visibility:visible;mso-wrap-style:square;mso-width-percent:1000;mso-height-percent:0;mso-top-percent:850;mso-wrap-distance-left:9pt;mso-wrap-distance-top:0;mso-wrap-distance-right:9pt;mso-wrap-distance-bottom:0;mso-position-horizontal:center;mso-position-horizontal-relative:margin;mso-position-vertical-relative:page;mso-width-percent:1000;mso-height-percent:0;mso-top-percent:850;mso-width-relative:margin;mso-height-relative:margin;v-text-anchor:bottom" o:gfxdata="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" filled="f" stroked="f" strokeweight=".5pt">
+                  <v:shape id="Text Box 142" o:spid="_x0000_s1026" type="#_x0000_t202" style="position:absolute;left:0;text-align:left;margin-left:0;margin-top:0;width:516pt;height:43.9pt;z-index:251659264;visibility:visible;mso-wrap-style:square;mso-width-percent:1000;mso-height-percent:0;mso-top-percent:850;mso-wrap-distance-left:9pt;mso-wrap-distance-top:0;mso-wrap-distance-right:9pt;mso-wrap-distance-bottom:0;mso-position-horizontal:center;mso-position-horizontal-relative:margin;mso-position-vertical-relative:page;mso-width-percent:1000;mso-height-percent:0;mso-top-percent:850;mso-width-relative:margin;mso-height-relative:margin;v-text-anchor:bottom" o:gfxdata="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" filled="f" stroked="f" strokeweight=".5pt">
                     <v:textbox style="mso-fit-shape-to-text:t" inset="0,0,0,0">
                       <w:txbxContent>
                         <w:p>
@@ -1518,6 +1518,9 @@
           </w:p>
           <w:p>
             <w:r>
+              <w:rPr>
+                <w:noProof/>
+              </w:rPr>
               <w:drawing>
                 <wp:inline distT="0" distB="0" distL="0" distR="0" wp14:anchorId="50F806AE" wp14:editId="68210745">
                   <wp:extent cx="3477260" cy="1238413"/>
@@ -1565,6 +1568,9 @@
           </w:p>
           <w:p>
             <w:r>
+              <w:rPr>
+                <w:noProof/>
+              </w:rPr>
               <w:lastRenderedPageBreak/>
               <w:drawing>
                 <wp:inline distT="0" distB="0" distL="0" distR="0" wp14:anchorId="468E17F6" wp14:editId="2426EE97">
@@ -1603,6 +1609,11 @@
               </w:drawing>
             </w:r>
           </w:p>
+          <w:p>
+            <w:r>
+              <w:t>In the future, users should have more ways to register such as using a Microsoft account.</w:t>
+            </w:r>
+          </w:p>
         </w:tc>
       </w:tr>
       <w:tr>
@@ -1646,6 +1657,9 @@
           </w:p>
           <w:p>
             <w:r>
+              <w:rPr>
+                <w:noProof/>
+              </w:rPr>
               <w:drawing>
                 <wp:inline distT="0" distB="0" distL="0" distR="0" wp14:anchorId="67F4C3B0" wp14:editId="6254562E">
                   <wp:extent cx="3484245" cy="1211942"/>
@@ -1690,6 +1704,9 @@
           </w:p>
           <w:p>
             <w:r>
+              <w:rPr>
+                <w:noProof/>
+              </w:rPr>
               <w:drawing>
                 <wp:inline distT="0" distB="0" distL="0" distR="0" wp14:anchorId="16B56C40" wp14:editId="6366FEAE">
                   <wp:extent cx="3495668" cy="1229904"/>
@@ -1727,6 +1744,17 @@
               </w:drawing>
             </w:r>
           </w:p>
+          <w:p>
+            <w:r>
+              <w:t xml:space="preserve">In the future, users should have more ways to </w:t>
+            </w:r>
+            <w:r>
+              <w:t>log in</w:t>
+            </w:r>
+            <w:r>
+              <w:t xml:space="preserve"> such as using a Microsoft account.</w:t>
+            </w:r>
+          </w:p>
         </w:tc>
       </w:tr>
       <w:tr>
@@ -1761,6 +1789,9 @@
             <w:r>
               <w:t>This is met fully as users can navigate to their profile where they can change their email and password.</w:t>
             </w:r>
+            <w:r>
+              <w:t xml:space="preserve"> In the future, it could be changed by allowing certain users, like the admin able to change other user’s details. </w:t>
+            </w:r>
           </w:p>
         </w:tc>
       </w:tr>
@@ -1802,6 +1833,9 @@
             <w:r>
               <w:t xml:space="preserve"> understand how their data is being used according to GDPR.</w:t>
             </w:r>
+            <w:r>
+              <w:t xml:space="preserve"> In the future, the privacy page should be laid out in a more readable way, since the layout does not match professionally made websites.</w:t>
+            </w:r>
           </w:p>
         </w:tc>
       </w:tr>
@@ -1873,7 +1907,11 @@
               <w:t xml:space="preserve">met fully </w:t>
             </w:r>
             <w:r>
-              <w:t xml:space="preserve">because the actual prices of the products were shown clear on products page, baskets’ page and the order page. However, the availability was not shown and therefore customers could buy product that was not available. </w:t>
+              <w:t xml:space="preserve">because the actual prices of the products were shown clear on products page, baskets’ page and the order page. However, the availability was not shown and </w:t>
+            </w:r>
+            <w:r>
+              <w:lastRenderedPageBreak/>
+              <w:t xml:space="preserve">therefore customers could buy product that was not available. </w:t>
             </w:r>
             <w:r>
               <w:t>This is shown in the feedback received (see below).</w:t>
@@ -1882,6 +1920,9 @@
               <w:t xml:space="preserve"> </w:t>
             </w:r>
             <w:r>
+              <w:rPr>
+                <w:noProof/>
+              </w:rPr>
               <w:drawing>
                 <wp:inline distT="0" distB="0" distL="0" distR="0" wp14:anchorId="569329D1" wp14:editId="66B82CDC">
                   <wp:extent cx="3519111" cy="1181100"/>
@@ -1921,7 +1962,6 @@
           </w:p>
           <w:p>
             <w:r>
-              <w:lastRenderedPageBreak/>
               <w:t>In the future customers should not be able to see or buy product that is not available.</w:t>
             </w:r>
           </w:p>
@@ -2035,6 +2075,9 @@
           </w:p>
           <w:p>
             <w:r>
+              <w:rPr>
+                <w:noProof/>
+              </w:rPr>
               <w:drawing>
                 <wp:inline distT="0" distB="0" distL="0" distR="0" wp14:anchorId="3B4A5E65" wp14:editId="5D72F36D">
                   <wp:extent cx="3504604" cy="1209675"/>
@@ -2072,6 +2115,11 @@
               </w:drawing>
             </w:r>
           </w:p>
+          <w:p>
+            <w:r>
+              <w:t>However, this could be improved in the future by allowing a button to see more details of the order clear on a separate page just for a specific product. This improvement will make the user experience better which will increase the likelihood of a user being retained for longer.</w:t>
+            </w:r>
+          </w:p>
         </w:tc>
       </w:tr>
       <w:tr>
@@ -2107,6 +2155,9 @@
               <w:t xml:space="preserve"> </w:t>
             </w:r>
             <w:r>
+              <w:rPr>
+                <w:noProof/>
+              </w:rPr>
               <w:drawing>
                 <wp:inline distT="0" distB="0" distL="0" distR="0" wp14:anchorId="5ECEA91C" wp14:editId="393A7E20">
                   <wp:extent cx="3496310" cy="678383"/>
@@ -2175,6 +2226,15 @@
             <w:r>
               <w:t>Because users cannot change the status of their order through cancelling it a customer or changing the status as an admin or producer.</w:t>
             </w:r>
+            <w:r>
+              <w:t xml:space="preserve"> In the future, </w:t>
+            </w:r>
+            <w:r>
+              <w:t>there</w:t>
+            </w:r>
+            <w:r>
+              <w:t xml:space="preserve"> should be a button for customers to cancel their orders, and producers should be able to use a dropdown to change an order’s status from their dashboard.</w:t>
+            </w:r>
           </w:p>
         </w:tc>
       </w:tr>
@@ -2205,7 +2265,11 @@
           </w:tcPr>
           <w:p>
             <w:r>
-              <w:t>Since there are discounts which any customer can use despite how long or how often they have been shopping with Greenfield Local Hub using the solution. This is not what a loyalty system is like in other website, therefore in the future the discount will need to be limited to how much a customer shops to be able to use the discounts.</w:t>
+              <w:t xml:space="preserve">Since there are discounts which any customer can use despite how long or how often they have been shopping with Greenfield Local Hub using the solution. This is not what a </w:t>
+            </w:r>
+            <w:r>
+              <w:lastRenderedPageBreak/>
+              <w:t>loyalty system is like in other website, therefore in the future the discount will need to be limited to how much a customer shops to be able to use the discounts.</w:t>
             </w:r>
           </w:p>
         </w:tc>
@@ -2217,6 +2281,7 @@
           </w:tcPr>
           <w:p>
             <w:r>
+              <w:lastRenderedPageBreak/>
               <w:t>Users able to change the application according to their accessibility needs</w:t>
             </w:r>
           </w:p>
@@ -2259,6 +2324,9 @@
           </w:p>
           <w:p>
             <w:r>
+              <w:rPr>
+                <w:noProof/>
+              </w:rPr>
               <w:drawing>
                 <wp:inline distT="0" distB="0" distL="0" distR="0" wp14:anchorId="32C29FD2" wp14:editId="24B50AFF">
                   <wp:extent cx="3489960" cy="1211424"/>
@@ -2298,7 +2366,9 @@
           </w:p>
           <w:p>
             <w:r>
-              <w:lastRenderedPageBreak/>
+              <w:rPr>
+                <w:noProof/>
+              </w:rPr>
               <w:drawing>
                 <wp:inline distT="0" distB="0" distL="0" distR="0" wp14:anchorId="558933A7" wp14:editId="6BE684D0">
                   <wp:extent cx="3483610" cy="1127723"/>
@@ -2345,7 +2415,6 @@
           </w:tcPr>
           <w:p>
             <w:r>
-              <w:lastRenderedPageBreak/>
               <w:t>Add access control pages based on user roles</w:t>
             </w:r>
           </w:p>
@@ -2380,6 +2449,9 @@
           </w:p>
           <w:p>
             <w:r>
+              <w:rPr>
+                <w:noProof/>
+              </w:rPr>
               <w:drawing>
                 <wp:inline distT="0" distB="0" distL="0" distR="0" wp14:anchorId="574F6229" wp14:editId="0249F03A">
                   <wp:extent cx="3475226" cy="1257300"/>
@@ -2417,6 +2489,11 @@
               </w:drawing>
             </w:r>
           </w:p>
+          <w:p>
+            <w:r>
+              <w:t>In the future, functionalities that are fixed or complete will have their authorisation for the appropriate users, so these functionalities can be used.</w:t>
+            </w:r>
+          </w:p>
         </w:tc>
       </w:tr>
     </w:tbl>
@@ -2553,7 +2630,11 @@
           </w:p>
           <w:p>
             <w:r>
-              <w:t>Webpages containing less than 20 high quality images should load within 30 milliseconds.</w:t>
+              <w:t xml:space="preserve">Webpages containing less than </w:t>
+            </w:r>
+            <w:r>
+              <w:lastRenderedPageBreak/>
+              <w:t>20 high quality images should load within 30 milliseconds.</w:t>
             </w:r>
           </w:p>
           <w:p>
@@ -2568,6 +2649,7 @@
           </w:tcPr>
           <w:p>
             <w:r>
+              <w:lastRenderedPageBreak/>
               <w:t>No</w:t>
             </w:r>
             <w:r>
@@ -2581,13 +2663,7 @@
           </w:tcPr>
           <w:p>
             <w:r>
-              <w:t xml:space="preserve">This is because webpages load within 15 milliseconds like the homepage or the </w:t>
-            </w:r>
-            <w:r>
-              <w:t>products</w:t>
-            </w:r>
-            <w:r>
-              <w:t xml:space="preserve">’ page as they need to fetch </w:t>
+              <w:t xml:space="preserve">This is because webpages load within 15 milliseconds like the homepage or the products’ page as they need to fetch </w:t>
             </w:r>
             <w:r>
               <w:t xml:space="preserve">a small amount of </w:t>
@@ -2596,22 +2672,14 @@
               <w:t>data</w:t>
             </w:r>
             <w:r>
-              <w:t xml:space="preserve">. </w:t>
-            </w:r>
-            <w:r>
-              <w:t>This does not impact the solution a lot currently as it does not need to load a lot of data, but this can be an issue in the future when it will be loading hundreds or products and basket items to users.</w:t>
-            </w:r>
-            <w:r>
-              <w:t xml:space="preserve"> </w:t>
-            </w:r>
-            <w:r>
-              <w:t xml:space="preserve">This could be changed by either caching the </w:t>
-            </w:r>
-            <w:r>
-              <w:t xml:space="preserve">products or basket items </w:t>
-            </w:r>
-            <w:r>
-              <w:t>data in the servers or reducing the amount of data needed to show on the pages.</w:t>
+              <w:t xml:space="preserve">. This does not impact the solution a lot currently as it does not need to load a lot of data, but this can be an issue in the future when it will be loading hundreds or products and basket items to users. </w:t>
+            </w:r>
+            <w:r>
+              <w:t xml:space="preserve">This could </w:t>
+            </w:r>
+            <w:r>
+              <w:lastRenderedPageBreak/>
+              <w:t>be changed by either caching the products or basket items data in the servers or reducing the amount of data needed to show on the pages.</w:t>
             </w:r>
           </w:p>
           <w:p/>
@@ -2681,7 +2749,6 @@
           </w:p>
           <w:p>
             <w:r>
-              <w:lastRenderedPageBreak/>
               <w:t>CPU usage should be under 15% on iPhone15 Pro Max.</w:t>
             </w:r>
           </w:p>
@@ -2692,7 +2759,6 @@
           </w:tcPr>
           <w:p>
             <w:r>
-              <w:lastRenderedPageBreak/>
               <w:t>Not fully</w:t>
             </w:r>
           </w:p>
@@ -2840,13 +2906,7 @@
           </w:tcPr>
           <w:p>
             <w:r>
-              <w:t xml:space="preserve">This is because no payment processors have been added yet, which means this will </w:t>
-            </w:r>
-            <w:r>
-              <w:t>need</w:t>
-            </w:r>
-            <w:r>
-              <w:t xml:space="preserve"> to be retested with a future improved solution that includes a payment processor.</w:t>
+              <w:t>This is because no payment processors have been added yet, which means this will need to be retested with a future improved solution that includes a payment processor.</w:t>
             </w:r>
           </w:p>
         </w:tc>
@@ -2861,7 +2921,11 @@
               <w:t>Orders’</w:t>
             </w:r>
             <w:r>
-              <w:t xml:space="preserve"> status should be updated fast when changed</w:t>
+              <w:t xml:space="preserve"> status should be </w:t>
+            </w:r>
+            <w:r>
+              <w:lastRenderedPageBreak/>
+              <w:t>updated fast when changed</w:t>
             </w:r>
             <w:r>
               <w:t>.</w:t>
@@ -2874,10 +2938,15 @@
           </w:tcPr>
           <w:p>
             <w:r>
+              <w:lastRenderedPageBreak/>
               <w:t>Orders’</w:t>
             </w:r>
             <w:r>
-              <w:t xml:space="preserve"> status being updated under 2 minutes after the status has been changed</w:t>
+              <w:t xml:space="preserve"> status being updated under 2 minutes after the </w:t>
+            </w:r>
+            <w:r>
+              <w:lastRenderedPageBreak/>
+              <w:t>status has been changed</w:t>
             </w:r>
             <w:r>
               <w:t>, during 50 or more orders’ statuses are being changed.</w:t>
@@ -2895,6 +2964,7 @@
           </w:tcPr>
           <w:p>
             <w:r>
+              <w:lastRenderedPageBreak/>
               <w:t>Yes</w:t>
             </w:r>
           </w:p>
@@ -2905,13 +2975,7 @@
           </w:tcPr>
           <w:p>
             <w:r>
-              <w:t xml:space="preserve">This is because the changes are saved instantly to the server, which means </w:t>
-            </w:r>
-            <w:r>
-              <w:t>whenever</w:t>
-            </w:r>
-            <w:r>
-              <w:t xml:space="preserve"> the user views the details of a</w:t>
+              <w:t>This is because the changes are saved instantly to the server, which means whenever the user views the details of a</w:t>
             </w:r>
             <w:r>
               <w:t>n order</w:t>
@@ -3089,11 +3153,7 @@
           </w:tcPr>
           <w:p>
             <w:r>
-              <w:t xml:space="preserve">Account password should be considered </w:t>
-            </w:r>
-            <w:r>
-              <w:lastRenderedPageBreak/>
-              <w:t>complex by industry standards</w:t>
+              <w:t>Account password should be considered complex by industry standards</w:t>
             </w:r>
           </w:p>
         </w:tc>
@@ -3103,12 +3163,7 @@
           </w:tcPr>
           <w:p>
             <w:r>
-              <w:lastRenderedPageBreak/>
-              <w:t xml:space="preserve">Account password should be at least 8 character long, </w:t>
-            </w:r>
-            <w:r>
-              <w:lastRenderedPageBreak/>
-              <w:t>contain letters, numbers and special characters to be consider complex.</w:t>
+              <w:t>Account password should be at least 8 character long, contain letters, numbers and special characters to be consider complex.</w:t>
             </w:r>
           </w:p>
         </w:tc>
@@ -3118,7 +3173,6 @@
           </w:tcPr>
           <w:p>
             <w:r>
-              <w:lastRenderedPageBreak/>
               <w:t>Yes</w:t>
             </w:r>
           </w:p>
@@ -3240,7 +3294,11 @@
           </w:tcPr>
           <w:p>
             <w:r>
-              <w:t>Important details like passwords and emails will be replaced with asterisks or dots, these will be the same amount regardless the number of characters.</w:t>
+              <w:t xml:space="preserve">Important details like passwords and emails will be replaced with asterisks or dots, these will be the same amount regardless the </w:t>
+            </w:r>
+            <w:r>
+              <w:lastRenderedPageBreak/>
+              <w:t>number of characters.</w:t>
             </w:r>
           </w:p>
         </w:tc>
@@ -3250,6 +3308,7 @@
           </w:tcPr>
           <w:p>
             <w:r>
+              <w:lastRenderedPageBreak/>
               <w:t>No</w:t>
             </w:r>
           </w:p>
@@ -3354,7 +3413,9 @@
           </w:p>
           <w:p>
             <w:r>
-              <w:lastRenderedPageBreak/>
+              <w:rPr>
+                <w:noProof/>
+              </w:rPr>
               <w:drawing>
                 <wp:inline distT="0" distB="0" distL="0" distR="0" wp14:anchorId="5E67D3CB" wp14:editId="47E329C7">
                   <wp:extent cx="3347499" cy="1211090"/>
@@ -3579,13 +3640,7 @@
           </w:tcPr>
           <w:p>
             <w:r>
-              <w:t xml:space="preserve">Since no systems has been added to spread </w:t>
-            </w:r>
-            <w:r>
-              <w:t xml:space="preserve">transactions </w:t>
-            </w:r>
-            <w:r>
-              <w:t>across servers to decrease likelihood of the server or system crashing.</w:t>
+              <w:t>Since no systems has been added to spread transactions across servers to decrease likelihood of the server or system crashing.</w:t>
             </w:r>
           </w:p>
         </w:tc>
@@ -3629,7 +3684,11 @@
           <w:tcPr>
             <w:tcW w:w="4110" w:type="dxa"/>
           </w:tcPr>
-          <w:p/>
+          <w:p>
+            <w:r>
+              <w:t>This is because the prototype uses the computer’s storage, which it has been installed on and this inefficient. Therefore, in the future a storage server will be linked to the solution to store all data of users.</w:t>
+            </w:r>
+          </w:p>
         </w:tc>
       </w:tr>
     </w:tbl>
@@ -3745,7 +3804,11 @@
           </w:tcPr>
           <w:p>
             <w:r>
-              <w:t xml:space="preserve">New functions should be added at an industry standard pace to the application </w:t>
+              <w:t xml:space="preserve">New functions should be added at an industry standard </w:t>
+            </w:r>
+            <w:r>
+              <w:lastRenderedPageBreak/>
+              <w:t xml:space="preserve">pace to the application </w:t>
             </w:r>
           </w:p>
         </w:tc>
@@ -3755,11 +3818,13 @@
           </w:tcPr>
           <w:p>
             <w:r>
+              <w:lastRenderedPageBreak/>
               <w:t>On average, every new major function should be added within 5 to 10 days.</w:t>
             </w:r>
           </w:p>
           <w:p>
             <w:r>
+              <w:lastRenderedPageBreak/>
               <w:t>On average, every new minor function should be added within 1 to 3 days.</w:t>
             </w:r>
           </w:p>
@@ -3770,6 +3835,7 @@
           </w:tcPr>
           <w:p>
             <w:r>
+              <w:lastRenderedPageBreak/>
               <w:t>Yes</w:t>
             </w:r>
           </w:p>
@@ -3778,7 +3844,15 @@
           <w:tcPr>
             <w:tcW w:w="4110" w:type="dxa"/>
           </w:tcPr>
-          <w:p/>
+          <w:p>
+            <w:r>
+              <w:t xml:space="preserve">The current code and document are organised using the MVC pattern, which is made to allow developer to development </w:t>
+            </w:r>
+            <w:r>
+              <w:lastRenderedPageBreak/>
+              <w:t>solutions quickly. However, the code could be improved by separating it into modular functions as that will allow the code to be easier to manage to develop the solution further.</w:t>
+            </w:r>
+          </w:p>
         </w:tc>
       </w:tr>
       <w:tr>
@@ -3816,7 +3890,11 @@
           <w:tcPr>
             <w:tcW w:w="4110" w:type="dxa"/>
           </w:tcPr>
-          <w:p/>
+          <w:p>
+            <w:r>
+              <w:t>Since there is no system added to disperse traffic, therefore in the future a scalable system will need to be developed that will disperse traffic across different servers.</w:t>
+            </w:r>
+          </w:p>
         </w:tc>
       </w:tr>
       <w:tr>
@@ -3846,7 +3924,7 @@
           </w:tcPr>
           <w:p>
             <w:r>
-              <w:t>Yes</w:t>
+              <w:t>Not fully</w:t>
             </w:r>
           </w:p>
         </w:tc>
@@ -3854,7 +3932,17 @@
           <w:tcPr>
             <w:tcW w:w="4110" w:type="dxa"/>
           </w:tcPr>
-          <w:p/>
+          <w:p>
+            <w:r>
+              <w:t xml:space="preserve">This is because the current codebase has been commented to allow developers new to the solution to be able understand it. However, </w:t>
+            </w:r>
+            <w:r>
+              <w:t>the codebase needs to be improved in the future by splitting redundant code into a separate function that is modular. This also will be applied to code sections that are</w:t>
+            </w:r>
+            <w:r>
+              <w:t xml:space="preserve"> too long or have too many nested pieces of code.</w:t>
+            </w:r>
+          </w:p>
         </w:tc>
       </w:tr>
     </w:tbl>
@@ -3865,7 +3953,6 @@
       </w:pPr>
       <w:bookmarkStart w:id="3" w:name="_Toc223976668"/>
       <w:r>
-        <w:lastRenderedPageBreak/>
         <w:t>Usability and Accessibility</w:t>
       </w:r>
       <w:bookmarkEnd w:id="3"/>
@@ -3877,10 +3964,10 @@
         <w:tblLook w:val="04A0" w:firstRow="1" w:lastRow="0" w:firstColumn="1" w:lastColumn="0" w:noHBand="0" w:noVBand="1"/>
       </w:tblPr>
       <w:tblGrid>
-        <w:gridCol w:w="2116"/>
-        <w:gridCol w:w="2951"/>
-        <w:gridCol w:w="1024"/>
-        <w:gridCol w:w="4110"/>
+        <w:gridCol w:w="1898"/>
+        <w:gridCol w:w="2231"/>
+        <w:gridCol w:w="835"/>
+        <w:gridCol w:w="5237"/>
       </w:tblGrid>
       <w:tr>
         <w:tc>
@@ -3999,7 +4086,11 @@
           <w:tcPr>
             <w:tcW w:w="4110" w:type="dxa"/>
           </w:tcPr>
-          <w:p/>
+          <w:p>
+            <w:r>
+              <w:t>This is because the pages only look normal as intended on desktop screens with a specific size. Given this, in the future the CSS files need to be changed to allow webpages to fit all devices with different screen sizes.</w:t>
+            </w:r>
+          </w:p>
         </w:tc>
       </w:tr>
       <w:tr>
@@ -4037,7 +4128,61 @@
           <w:tcPr>
             <w:tcW w:w="4110" w:type="dxa"/>
           </w:tcPr>
-          <w:p/>
+          <w:p>
+            <w:r>
+              <w:t xml:space="preserve">Since </w:t>
+            </w:r>
+            <w:r>
+              <w:t>users find the website easy to navigate as shown from the user feedback (see below)</w:t>
+            </w:r>
+            <w:r>
+              <w:t>.</w:t>
+            </w:r>
+          </w:p>
+          <w:p>
+            <w:r>
+              <w:drawing>
+                <wp:inline distT="0" distB="0" distL="0" distR="0" wp14:anchorId="38B6CA89" wp14:editId="12E996EE">
+                  <wp:extent cx="3188335" cy="549927"/>
+                  <wp:effectExtent l="0" t="0" r="0" b="2540"/>
+                  <wp:docPr id="802927186" name="Picture 1"/>
+                  <wp:cNvGraphicFramePr>
+                    <a:graphicFrameLocks xmlns:a="http://schemas.openxmlformats.org/drawingml/2006/main" noChangeAspect="1"/>
+                  </wp:cNvGraphicFramePr>
+                  <a:graphic xmlns:a="http://schemas.openxmlformats.org/drawingml/2006/main">
+                    <a:graphicData uri="http://schemas.openxmlformats.org/drawingml/2006/picture">
+                      <pic:pic xmlns:pic="http://schemas.openxmlformats.org/drawingml/2006/picture">
+                        <pic:nvPicPr>
+                          <pic:cNvPr id="802927186" name=""/>
+                          <pic:cNvPicPr/>
+                        </pic:nvPicPr>
+                        <pic:blipFill>
+                          <a:blip r:embed="rId17"/>
+                          <a:stretch>
+                            <a:fillRect/>
+                          </a:stretch>
+                        </pic:blipFill>
+                        <pic:spPr>
+                          <a:xfrm>
+                            <a:off x="0" y="0"/>
+                            <a:ext cx="3371613" cy="581539"/>
+                          </a:xfrm>
+                          <a:prstGeom prst="rect">
+                            <a:avLst/>
+                          </a:prstGeom>
+                        </pic:spPr>
+                      </pic:pic>
+                    </a:graphicData>
+                  </a:graphic>
+                </wp:inline>
+              </w:drawing>
+            </w:r>
+          </w:p>
+          <w:p>
+            <w:r>
+              <w:t>However, this could be improved by adding a ‘Back’ button to allow users go back to different pages, which improves user experience and allows to be at a level of other similar websites.</w:t>
+            </w:r>
+          </w:p>
         </w:tc>
       </w:tr>
       <w:tr>
@@ -4075,7 +4220,11 @@
           <w:tcPr>
             <w:tcW w:w="4110" w:type="dxa"/>
           </w:tcPr>
-          <w:p/>
+          <w:p>
+            <w:r>
+              <w:t>This is because all elements that can be interacted with have some sort of visual state change, such as buttons’ colours changing slightly. But this can be improved in the future by adding a slight animation to indicate interactive elements more concretely and support users who have colour-blindness. In turn this improves the websites overall accessibility and use experience.</w:t>
+            </w:r>
+          </w:p>
         </w:tc>
       </w:tr>
       <w:tr>
@@ -4085,7 +4234,11 @@
           </w:tcPr>
           <w:p>
             <w:r>
-              <w:t>Should have maintain consistent visual design and content tone throughout all pages</w:t>
+              <w:t xml:space="preserve">Should have maintain consistent visual design and content tone </w:t>
+            </w:r>
+            <w:r>
+              <w:lastRenderedPageBreak/>
+              <w:t>throughout all pages</w:t>
             </w:r>
           </w:p>
         </w:tc>
@@ -4095,6 +4248,7 @@
           </w:tcPr>
           <w:p>
             <w:r>
+              <w:lastRenderedPageBreak/>
               <w:t>All pages should fully adhere to the design document of the website.</w:t>
             </w:r>
           </w:p>
@@ -4105,7 +4259,7 @@
           </w:tcPr>
           <w:p>
             <w:r>
-              <w:t>Yes</w:t>
+              <w:t>No</w:t>
             </w:r>
           </w:p>
         </w:tc>
@@ -4113,7 +4267,83 @@
           <w:tcPr>
             <w:tcW w:w="4110" w:type="dxa"/>
           </w:tcPr>
-          <w:p/>
+          <w:p>
+            <w:r>
+              <w:t xml:space="preserve">Since </w:t>
+            </w:r>
+            <w:r>
+              <w:t xml:space="preserve">the </w:t>
+            </w:r>
+            <w:r>
+              <w:t xml:space="preserve">users pointed out that the colour scheme did not fit the website </w:t>
+            </w:r>
+            <w:r>
+              <w:t>or felt ‘plain’</w:t>
+            </w:r>
+            <w:r>
+              <w:t xml:space="preserve"> and the</w:t>
+            </w:r>
+            <w:r>
+              <w:t xml:space="preserve"> User feedback </w:t>
+            </w:r>
+            <w:r>
+              <w:t xml:space="preserve">is </w:t>
+            </w:r>
+            <w:r>
+              <w:t>below.</w:t>
+            </w:r>
+          </w:p>
+          <w:p>
+            <w:r>
+              <w:lastRenderedPageBreak/>
+              <w:drawing>
+                <wp:inline distT="0" distB="0" distL="0" distR="0" wp14:anchorId="7D58DB88" wp14:editId="59577C5D">
+                  <wp:extent cx="3129505" cy="876300"/>
+                  <wp:effectExtent l="0" t="0" r="0" b="0"/>
+                  <wp:docPr id="708149381" name="Picture 1"/>
+                  <wp:cNvGraphicFramePr>
+                    <a:graphicFrameLocks xmlns:a="http://schemas.openxmlformats.org/drawingml/2006/main" noChangeAspect="1"/>
+                  </wp:cNvGraphicFramePr>
+                  <a:graphic xmlns:a="http://schemas.openxmlformats.org/drawingml/2006/main">
+                    <a:graphicData uri="http://schemas.openxmlformats.org/drawingml/2006/picture">
+                      <pic:pic xmlns:pic="http://schemas.openxmlformats.org/drawingml/2006/picture">
+                        <pic:nvPicPr>
+                          <pic:cNvPr id="708149381" name=""/>
+                          <pic:cNvPicPr/>
+                        </pic:nvPicPr>
+                        <pic:blipFill>
+                          <a:blip r:embed="rId18"/>
+                          <a:stretch>
+                            <a:fillRect/>
+                          </a:stretch>
+                        </pic:blipFill>
+                        <pic:spPr>
+                          <a:xfrm>
+                            <a:off x="0" y="0"/>
+                            <a:ext cx="3166897" cy="886770"/>
+                          </a:xfrm>
+                          <a:prstGeom prst="rect">
+                            <a:avLst/>
+                          </a:prstGeom>
+                        </pic:spPr>
+                      </pic:pic>
+                    </a:graphicData>
+                  </a:graphic>
+                </wp:inline>
+              </w:drawing>
+            </w:r>
+          </w:p>
+          <w:p>
+            <w:r>
+              <w:t>To improve on this, in the future a background texture will be added to ensure the background does not seem ‘plain’</w:t>
+            </w:r>
+            <w:r>
+              <w:t xml:space="preserve">, and </w:t>
+            </w:r>
+            <w:r>
+              <w:t>a new colour scheme will be chosen to fit the locally produced food and farming vibe.</w:t>
+            </w:r>
+          </w:p>
         </w:tc>
       </w:tr>
       <w:tr>
@@ -4123,6 +4353,7 @@
           </w:tcPr>
           <w:p>
             <w:r>
+              <w:lastRenderedPageBreak/>
               <w:t>The solution must show errors in an informative and understandable way.</w:t>
             </w:r>
           </w:p>
@@ -4151,7 +4382,17 @@
           <w:tcPr>
             <w:tcW w:w="4110" w:type="dxa"/>
           </w:tcPr>
-          <w:p/>
+          <w:p>
+            <w:r>
+              <w:t xml:space="preserve">This is because many fields for forms have validation made from the default generated by the ASP.NET </w:t>
+            </w:r>
+            <w:r>
+              <w:t>framework, but this means there are no validation built for special fields like an address.</w:t>
+            </w:r>
+            <w:r>
+              <w:t xml:space="preserve"> To handle this, in the future custom validation will be added ensure users cannot added a false address to an order, or input an order date in the past, and other types of validation is implemented with their respective informative error messages for the users.</w:t>
+            </w:r>
+          </w:p>
         </w:tc>
       </w:tr>
     </w:tbl>
@@ -4198,6 +4439,18 @@
       </w:r>
       <w:r>
         <w:t xml:space="preserve"> Greenfield Local Hub solution.</w:t>
+      </w:r>
+    </w:p>
+    <w:p>
+      <w:pPr>
+        <w:pStyle w:val="ListParagraph"/>
+        <w:numPr>
+          <w:ilvl w:val="0"/>
+          <w:numId w:val="9"/>
+        </w:numPr>
+      </w:pPr>
+      <w:r>
+        <w:t>Allow the webpages to fit all screen size.</w:t>
       </w:r>
     </w:p>
     <w:sectPr>
@@ -5678,6 +5931,7 @@
   <w:style w:type="character" w:default="1" w:styleId="DefaultParagraphFont">
     <w:name w:val="Default Paragraph Font"/>
     <w:uiPriority w:val="1"/>
+    <w:semiHidden/>
     <w:unhideWhenUsed/>
   </w:style>
   <w:style w:type="table" w:default="1" w:styleId="TableNormal">
@@ -5940,11 +6194,13 @@
   </w:compat>
   <w:rsids>
     <w:rsidRoot w:val="00455CEF"/>
+    <w:rsid w:val="00072A06"/>
     <w:rsid w:val="001E74CD"/>
     <w:rsid w:val="00380304"/>
     <w:rsid w:val="00381446"/>
     <w:rsid w:val="00455CEF"/>
     <w:rsid w:val="00540361"/>
+    <w:rsid w:val="00764A13"/>
     <w:rsid w:val="007710DB"/>
     <w:rsid w:val="00974029"/>
     <w:rsid w:val="00A725BF"/>

</xml_diff>